<commit_message>
Sponsor marquee rotation + award notification mechanism
- Rewrite sponsorRotation.js: paid sponsors occupy top 'headliner' slots,
  cyclically shift one position per day (marquee). Each sponsor contributes
  its highest-weight product per position. Anchored to activity start date.
- Rules page: add 开奖与通知 section (daily post公示 + 站内信 real-time notify)
- Sponsorship doc: rewrite section 4.2 to marquee rotation with rotation table,
  add 3.4 开奖与发奖通知, note backend 40-50 product list, update pool counts to 30
</commit_message>
<xml_diff>
--- a/ETF球队老板H5招商说明书.docx
+++ b/ETF球队老板H5招商说明书.docx
@@ -1821,43 +1821,6 @@
     </w:p>
     <w:p>
       <w:pPr>
-        <w:pStyle w:val="Heading1"/>
-        <w:spacing w:after="200" w:before="360"/>
-      </w:pPr>
-      <w:r>
-        <w:rPr>
-          <w:rFonts w:ascii="微软雅黑" w:cs="微软雅黑" w:eastAsia="微软雅黑" w:hAnsi="微软雅黑"/>
-          <w:b/>
-          <w:bCs/>
-          <w:sz w:val="32"/>
-          <w:szCs w:val="32"/>
-        </w:rPr>
-        <w:t xml:space="preserve">四、招商资源位（重点）</w:t>
-      </w:r>
-    </w:p>
-    <w:p>
-      <w:pPr>
-        <w:spacing w:after="100"/>
-        <w:rPr>
-          <w:i/>
-          <w:iCs/>
-          <w:color w:val="666666"/>
-        </w:rPr>
-      </w:pPr>
-      <w:r>
-        <w:rPr>
-          <w:rFonts w:ascii="微软雅黑" w:cs="微软雅黑" w:eastAsia="微软雅黑" w:hAnsi="微软雅黑"/>
-          <w:i/>
-          <w:iCs/>
-          <w:color w:val="666666"/>
-          <w:sz w:val="22"/>
-          <w:szCs w:val="22"/>
-        </w:rPr>
-        <w:t xml:space="preserve">当前 H5 提供 3 类核心招商资源位，每类资源位可独立计价：</w:t>
-      </w:r>
-    </w:p>
-    <w:p>
-      <w:pPr>
         <w:pStyle w:val="Heading2"/>
         <w:spacing w:after="160" w:before="280"/>
       </w:pPr>
@@ -1870,6 +1833,132 @@
           <w:sz w:val="26"/>
           <w:szCs w:val="26"/>
         </w:rPr>
+        <w:t xml:space="preserve">3.4 开奖与发奖通知</w:t>
+      </w:r>
+    </w:p>
+    <w:p>
+      <w:pPr>
+        <w:pStyle w:val="ListParagraph"/>
+        <w:numPr>
+          <w:ilvl w:val="0"/>
+          <w:numId w:val="2"/>
+        </w:numPr>
+        <w:spacing w:after="80"/>
+      </w:pPr>
+      <w:r>
+        <w:rPr>
+          <w:rFonts w:ascii="微软雅黑" w:cs="微软雅黑" w:eastAsia="微软雅黑" w:hAnsi="微软雅黑"/>
+          <w:sz w:val="22"/>
+          <w:szCs w:val="22"/>
+        </w:rPr>
+        <w:t xml:space="preserve">开奖公示：每天发布一篇雪球帖子，公示当日 / 当周获奖人员名单</w:t>
+      </w:r>
+    </w:p>
+    <w:p>
+      <w:pPr>
+        <w:pStyle w:val="ListParagraph"/>
+        <w:numPr>
+          <w:ilvl w:val="0"/>
+          <w:numId w:val="2"/>
+        </w:numPr>
+        <w:spacing w:after="80"/>
+      </w:pPr>
+      <w:r>
+        <w:rPr>
+          <w:rFonts w:ascii="微软雅黑" w:cs="微软雅黑" w:eastAsia="微软雅黑" w:hAnsi="微软雅黑"/>
+          <w:sz w:val="22"/>
+          <w:szCs w:val="22"/>
+        </w:rPr>
+        <w:t xml:space="preserve">实时通知：获奖结果通过雪球「站内信」实时发送给获奖球友</w:t>
+      </w:r>
+    </w:p>
+    <w:p>
+      <w:pPr>
+        <w:pStyle w:val="ListParagraph"/>
+        <w:numPr>
+          <w:ilvl w:val="0"/>
+          <w:numId w:val="2"/>
+        </w:numPr>
+        <w:spacing w:after="80"/>
+      </w:pPr>
+      <w:r>
+        <w:rPr>
+          <w:rFonts w:ascii="微软雅黑" w:cs="微软雅黑" w:eastAsia="微软雅黑" w:hAnsi="微软雅黑"/>
+          <w:sz w:val="22"/>
+          <w:szCs w:val="22"/>
+        </w:rPr>
+        <w:t xml:space="preserve">实物发放：获奖球友收到站内信后，按提示回复收货信息，由雪球官方统一寄出</w:t>
+      </w:r>
+    </w:p>
+    <w:p>
+      <w:pPr>
+        <w:pStyle w:val="ListParagraph"/>
+        <w:numPr>
+          <w:ilvl w:val="0"/>
+          <w:numId w:val="2"/>
+        </w:numPr>
+        <w:spacing w:after="80"/>
+      </w:pPr>
+      <w:r>
+        <w:rPr>
+          <w:rFonts w:ascii="微软雅黑" w:cs="微软雅黑" w:eastAsia="微软雅黑" w:hAnsi="微软雅黑"/>
+          <w:sz w:val="22"/>
+          <w:szCs w:val="22"/>
+        </w:rPr>
+        <w:t xml:space="preserve">未及时回复 / 地址失效导致无法送达的，视为放弃奖品</w:t>
+      </w:r>
+    </w:p>
+    <w:p>
+      <w:pPr>
+        <w:pStyle w:val="Heading1"/>
+        <w:spacing w:after="200" w:before="360"/>
+      </w:pPr>
+      <w:r>
+        <w:rPr>
+          <w:rFonts w:ascii="微软雅黑" w:cs="微软雅黑" w:eastAsia="微软雅黑" w:hAnsi="微软雅黑"/>
+          <w:b/>
+          <w:bCs/>
+          <w:sz w:val="32"/>
+          <w:szCs w:val="32"/>
+        </w:rPr>
+        <w:t xml:space="preserve">四、招商资源位（重点）</w:t>
+      </w:r>
+    </w:p>
+    <w:p>
+      <w:pPr>
+        <w:spacing w:after="100"/>
+        <w:rPr>
+          <w:i/>
+          <w:iCs/>
+          <w:color w:val="666666"/>
+        </w:rPr>
+      </w:pPr>
+      <w:r>
+        <w:rPr>
+          <w:rFonts w:ascii="微软雅黑" w:cs="微软雅黑" w:eastAsia="微软雅黑" w:hAnsi="微软雅黑"/>
+          <w:i/>
+          <w:iCs/>
+          <w:color w:val="666666"/>
+          <w:sz w:val="22"/>
+          <w:szCs w:val="22"/>
+        </w:rPr>
+        <w:t xml:space="preserve">当前 H5 提供 3 类核心招商资源位，每类资源位可独立计价：</w:t>
+      </w:r>
+    </w:p>
+    <w:p>
+      <w:pPr>
+        <w:pStyle w:val="Heading2"/>
+        <w:spacing w:after="160" w:before="280"/>
+      </w:pPr>
+      <w:r>
+        <w:rPr>
+          <w:rFonts w:ascii="微软雅黑" w:cs="微软雅黑" w:eastAsia="微软雅黑" w:hAnsi="微软雅黑"/>
+          <w:b/>
+          <w:bCs/>
+          <w:color w:val="0A0A0A"/>
+          <w:sz w:val="26"/>
+          <w:szCs w:val="26"/>
+        </w:rPr>
         <w:t xml:space="preserve">4.1 资源位 A：ETF 产品池</w:t>
       </w:r>
     </w:p>
@@ -1905,6 +1994,27 @@
     </w:p>
     <w:p>
       <w:pPr>
+        <w:spacing w:after="100"/>
+        <w:rPr>
+          <w:i/>
+          <w:iCs/>
+          <w:color w:val="666666"/>
+        </w:rPr>
+      </w:pPr>
+      <w:r>
+        <w:rPr>
+          <w:rFonts w:ascii="微软雅黑" w:cs="微软雅黑" w:eastAsia="微软雅黑" w:hAnsi="微软雅黑"/>
+          <w:i/>
+          <w:iCs/>
+          <w:color w:val="666666"/>
+          <w:sz w:val="22"/>
+          <w:szCs w:val="22"/>
+        </w:rPr>
+        <w:t xml:space="preserve">后台维护一份完整 ETF 名单（目前约 40-50 只产品），按位置分类。前端展示池从该名单中按位置取数；招商客户的产品通过运营后台标记进入对应位置池。</w:t>
+      </w:r>
+    </w:p>
+    <w:p>
+      <w:pPr>
         <w:pStyle w:val="Heading3"/>
         <w:spacing w:after="120" w:before="220"/>
       </w:pPr>
@@ -1917,7 +2027,7 @@
           <w:sz w:val="22"/>
           <w:szCs w:val="22"/>
         </w:rPr>
-        <w:t xml:space="preserve">当前容量</w:t>
+        <w:t xml:space="preserve">当前 H5 演示池容量</w:t>
       </w:r>
     </w:p>
     <w:tbl>
@@ -2004,7 +2114,7 @@
                 <w:sz w:val="20"/>
                 <w:szCs w:val="20"/>
               </w:rPr>
-              <w:t xml:space="preserve">当前池大小</w:t>
+              <w:t xml:space="preserve">演示池大小</w:t>
             </w:r>
           </w:p>
         </w:tc>
@@ -2070,7 +2180,7 @@
                 <w:sz w:val="20"/>
                 <w:szCs w:val="20"/>
               </w:rPr>
-              <w:t xml:space="preserve">扩容空间</w:t>
+              <w:t xml:space="preserve">后台名单</w:t>
             </w:r>
           </w:p>
         </w:tc>
@@ -2132,7 +2242,7 @@
                 <w:sz w:val="20"/>
                 <w:szCs w:val="20"/>
               </w:rPr>
-              <w:t xml:space="preserve">8 只</w:t>
+              <w:t xml:space="preserve">9 只</w:t>
             </w:r>
           </w:p>
         </w:tc>
@@ -2193,7 +2303,7 @@
                 <w:sz w:val="20"/>
                 <w:szCs w:val="20"/>
               </w:rPr>
-              <w:t xml:space="preserve">可扩至 12-15</w:t>
+              <w:t xml:space="preserve">运营维护</w:t>
             </w:r>
           </w:p>
         </w:tc>
@@ -2255,7 +2365,7 @@
                 <w:sz w:val="20"/>
                 <w:szCs w:val="20"/>
               </w:rPr>
-              <w:t xml:space="preserve">8 只</w:t>
+              <w:t xml:space="preserve">9 只</w:t>
             </w:r>
           </w:p>
         </w:tc>
@@ -2316,7 +2426,7 @@
                 <w:sz w:val="20"/>
                 <w:szCs w:val="20"/>
               </w:rPr>
-              <w:t xml:space="preserve">可扩至 12-15</w:t>
+              <w:t xml:space="preserve">运营维护</w:t>
             </w:r>
           </w:p>
         </w:tc>
@@ -2378,7 +2488,7 @@
                 <w:sz w:val="20"/>
                 <w:szCs w:val="20"/>
               </w:rPr>
-              <w:t xml:space="preserve">6 只</w:t>
+              <w:t xml:space="preserve">7 只</w:t>
             </w:r>
           </w:p>
         </w:tc>
@@ -2435,11 +2545,11 @@
             <w:r>
               <w:rPr>
                 <w:rFonts w:ascii="微软雅黑" w:cs="微软雅黑" w:eastAsia="微软雅黑" w:hAnsi="微软雅黑"/>
-                <w:color w:val="E63946"/>
-                <w:sz w:val="20"/>
-                <w:szCs w:val="20"/>
-              </w:rPr>
-              <w:t xml:space="preserve">建议补到 8+</w:t>
+                <w:color w:val="2A85E0"/>
+                <w:sz w:val="20"/>
+                <w:szCs w:val="20"/>
+              </w:rPr>
+              <w:t xml:space="preserve">运营维护</w:t>
             </w:r>
           </w:p>
         </w:tc>
@@ -2558,10 +2668,11 @@
             <w:r>
               <w:rPr>
                 <w:rFonts w:ascii="微软雅黑" w:cs="微软雅黑" w:eastAsia="微软雅黑" w:hAnsi="微软雅黑"/>
-                <w:sz w:val="20"/>
-                <w:szCs w:val="20"/>
-              </w:rPr>
-              <w:t xml:space="preserve">5 只够用</w:t>
+                <w:color w:val="2A85E0"/>
+                <w:sz w:val="20"/>
+                <w:szCs w:val="20"/>
+              </w:rPr>
+              <w:t xml:space="preserve">运营维护</w:t>
             </w:r>
           </w:p>
         </w:tc>
@@ -2583,7 +2694,7 @@
           <w:sz w:val="22"/>
           <w:szCs w:val="22"/>
         </w:rPr>
-        <w:t xml:space="preserve">合计当前池：27 只 ETF。</w:t>
+        <w:t xml:space="preserve">当前 H5 演示池合计：30 只 ETF。正式上线时由后台 40-50 只名单驱动。</w:t>
       </w:r>
     </w:p>
     <w:p>
@@ -2761,7 +2872,7 @@
           <w:sz w:val="26"/>
           <w:szCs w:val="26"/>
         </w:rPr>
-        <w:t xml:space="preserve">4.2 资源位 B：「今日推荐」金色徽章</w:t>
+        <w:t xml:space="preserve">4.2 资源位 B：招商「跑马灯」轮转头牌位</w:t>
       </w:r>
     </w:p>
     <w:p>
@@ -2778,7 +2889,7 @@
           <w:sz w:val="22"/>
           <w:szCs w:val="22"/>
         </w:rPr>
-        <w:t xml:space="preserve">描述</w:t>
+        <w:t xml:space="preserve">机制说明</w:t>
       </w:r>
     </w:p>
     <w:p>
@@ -2791,7 +2902,61 @@
           <w:sz w:val="22"/>
           <w:szCs w:val="22"/>
         </w:rPr>
-        <w:t xml:space="preserve">每个位置的产品列表中，排在第一位的 ETF 自带「今日推荐」金色徽章 + 渐变光晕背景。该位置由"招商客户日轮动"机制决定。</w:t>
+        <w:t xml:space="preserve">已付费的招商客户占据每个位置 ETF 列表的头部「头牌位」。每个客户在所属位置贡献一只「头牌产品」，按轮转顺序排列。排在第一位的产品自带「今日推荐」金色徽章 + 渐变光晕背景。</w:t>
+      </w:r>
+    </w:p>
+    <w:p>
+      <w:pPr>
+        <w:pStyle w:val="ListParagraph"/>
+        <w:numPr>
+          <w:ilvl w:val="0"/>
+          <w:numId w:val="2"/>
+        </w:numPr>
+        <w:spacing w:after="80"/>
+      </w:pPr>
+      <w:r>
+        <w:rPr>
+          <w:rFonts w:ascii="微软雅黑" w:cs="微软雅黑" w:eastAsia="微软雅黑" w:hAnsi="微软雅黑"/>
+          <w:sz w:val="22"/>
+          <w:szCs w:val="22"/>
+        </w:rPr>
+        <w:t xml:space="preserve">活动第 1 天：头牌位按招商客户签约顺序排列</w:t>
+      </w:r>
+    </w:p>
+    <w:p>
+      <w:pPr>
+        <w:pStyle w:val="ListParagraph"/>
+        <w:numPr>
+          <w:ilvl w:val="0"/>
+          <w:numId w:val="2"/>
+        </w:numPr>
+        <w:spacing w:after="80"/>
+      </w:pPr>
+      <w:r>
+        <w:rPr>
+          <w:rFonts w:ascii="微软雅黑" w:cs="微软雅黑" w:eastAsia="微软雅黑" w:hAnsi="微软雅黑"/>
+          <w:sz w:val="22"/>
+          <w:szCs w:val="22"/>
+        </w:rPr>
+        <w:t xml:space="preserve">从第 2 天起：整体「跑马灯式」轮转一位 —— 原第一位移到末位，其余依次前移</w:t>
+      </w:r>
+    </w:p>
+    <w:p>
+      <w:pPr>
+        <w:pStyle w:val="ListParagraph"/>
+        <w:numPr>
+          <w:ilvl w:val="0"/>
+          <w:numId w:val="2"/>
+        </w:numPr>
+        <w:spacing w:after="80"/>
+      </w:pPr>
+      <w:r>
+        <w:rPr>
+          <w:rFonts w:ascii="微软雅黑" w:cs="微软雅黑" w:eastAsia="微软雅黑" w:hAnsi="微软雅黑"/>
+          <w:sz w:val="22"/>
+          <w:szCs w:val="22"/>
+        </w:rPr>
+        <w:t xml:space="preserve">保证每个招商客户在轮转周期内，都能轮到「第一位 / 今日推荐」的曝光</w:t>
       </w:r>
     </w:p>
     <w:p>
@@ -2808,81 +2973,611 @@
           <w:sz w:val="22"/>
           <w:szCs w:val="22"/>
         </w:rPr>
-        <w:t xml:space="preserve">日轮动机制</w:t>
-      </w:r>
-    </w:p>
-    <w:p>
-      <w:pPr>
-        <w:pStyle w:val="ListParagraph"/>
-        <w:numPr>
-          <w:ilvl w:val="0"/>
-          <w:numId w:val="2"/>
-        </w:numPr>
-        <w:spacing w:after="80"/>
-      </w:pPr>
-      <w:r>
-        <w:rPr>
-          <w:rFonts w:ascii="微软雅黑" w:cs="微软雅黑" w:eastAsia="微软雅黑" w:hAnsi="微软雅黑"/>
-          <w:sz w:val="22"/>
-          <w:szCs w:val="22"/>
-        </w:rPr>
-        <w:t xml:space="preserve">系统按日期对所有招商客户进行公平轮值</w:t>
-      </w:r>
-    </w:p>
-    <w:p>
-      <w:pPr>
-        <w:pStyle w:val="ListParagraph"/>
-        <w:numPr>
-          <w:ilvl w:val="0"/>
-          <w:numId w:val="2"/>
-        </w:numPr>
-        <w:spacing w:after="80"/>
-      </w:pPr>
-      <w:r>
-        <w:rPr>
-          <w:rFonts w:ascii="微软雅黑" w:cs="微软雅黑" w:eastAsia="微软雅黑" w:hAnsi="微软雅黑"/>
-          <w:sz w:val="22"/>
-          <w:szCs w:val="22"/>
-        </w:rPr>
-        <w:t xml:space="preserve">当日轮值的客户，其旗下产品在所属位置的列表里被排到第一位，获得徽章 + 置顶</w:t>
-      </w:r>
-    </w:p>
-    <w:p>
-      <w:pPr>
-        <w:pStyle w:val="ListParagraph"/>
-        <w:numPr>
-          <w:ilvl w:val="0"/>
-          <w:numId w:val="2"/>
-        </w:numPr>
-        <w:spacing w:after="80"/>
-      </w:pPr>
-      <w:r>
-        <w:rPr>
-          <w:rFonts w:ascii="微软雅黑" w:cs="微软雅黑" w:eastAsia="微软雅黑" w:hAnsi="微软雅黑"/>
-          <w:sz w:val="22"/>
-          <w:szCs w:val="22"/>
-        </w:rPr>
-        <w:t xml:space="preserve">举例：第一天 华夏 / 第二天 富国 / 第三天 易方达 / 循环</w:t>
-      </w:r>
-    </w:p>
-    <w:p>
-      <w:pPr>
-        <w:pStyle w:val="ListParagraph"/>
-        <w:numPr>
-          <w:ilvl w:val="0"/>
-          <w:numId w:val="2"/>
-        </w:numPr>
-        <w:spacing w:after="80"/>
-      </w:pPr>
-      <w:r>
-        <w:rPr>
-          <w:rFonts w:ascii="微软雅黑" w:cs="微软雅黑" w:eastAsia="微软雅黑" w:hAnsi="微软雅黑"/>
-          <w:sz w:val="22"/>
-          <w:szCs w:val="22"/>
-        </w:rPr>
-        <w:t xml:space="preserve">确保每个招商客户都有公平的"头牌位"曝光机会</w:t>
-      </w:r>
-    </w:p>
+        <w:t xml:space="preserve">轮转示例（假设 A=华夏、B=易方达、C=富国 三家签约）</w:t>
+      </w:r>
+    </w:p>
+    <w:tbl>
+      <w:tblPr>
+        <w:tblW w:type="dxa" w:w="9120"/>
+        <w:tblBorders>
+          <w:top w:val="single" w:color="auto" w:sz="4"/>
+          <w:left w:val="single" w:color="auto" w:sz="4"/>
+          <w:bottom w:val="single" w:color="auto" w:sz="4"/>
+          <w:right w:val="single" w:color="auto" w:sz="4"/>
+          <w:insideH w:val="single" w:color="auto" w:sz="4"/>
+          <w:insideV w:val="single" w:color="auto" w:sz="4"/>
+        </w:tblBorders>
+      </w:tblPr>
+      <w:tblGrid>
+        <w:gridCol w:w="1560"/>
+        <w:gridCol w:w="2520"/>
+        <w:gridCol w:w="2520"/>
+        <w:gridCol w:w="2520"/>
+      </w:tblGrid>
+      <w:tr>
+        <w:trPr>
+          <w:tblHeader/>
+        </w:trPr>
+        <w:tc>
+          <w:tcPr>
+            <w:tcW w:type="dxa" w:w="1560"/>
+            <w:tcBorders>
+              <w:top w:val="single" w:color="CCCCCC" w:sz="6"/>
+              <w:left w:val="single" w:color="CCCCCC" w:sz="6"/>
+              <w:bottom w:val="single" w:color="CCCCCC" w:sz="6"/>
+              <w:right w:val="single" w:color="CCCCCC" w:sz="6"/>
+            </w:tcBorders>
+            <w:shd w:fill="F0F0F0" w:val="clear"/>
+            <w:tcMar>
+              <w:top w:type="dxa" w:w="80"/>
+              <w:left w:type="dxa" w:w="120"/>
+              <w:bottom w:type="dxa" w:w="80"/>
+              <w:right w:type="dxa" w:w="120"/>
+            </w:tcMar>
+          </w:tcPr>
+          <w:p>
+            <w:pPr>
+              <w:jc w:val="center"/>
+            </w:pPr>
+            <w:r>
+              <w:rPr>
+                <w:rFonts w:ascii="微软雅黑" w:cs="微软雅黑" w:eastAsia="微软雅黑" w:hAnsi="微软雅黑"/>
+                <w:b/>
+                <w:bCs/>
+                <w:sz w:val="20"/>
+                <w:szCs w:val="20"/>
+              </w:rPr>
+              <w:t xml:space="preserve">日期</w:t>
+            </w:r>
+          </w:p>
+        </w:tc>
+        <w:tc>
+          <w:tcPr>
+            <w:tcW w:type="dxa" w:w="2520"/>
+            <w:tcBorders>
+              <w:top w:val="single" w:color="CCCCCC" w:sz="6"/>
+              <w:left w:val="single" w:color="CCCCCC" w:sz="6"/>
+              <w:bottom w:val="single" w:color="CCCCCC" w:sz="6"/>
+              <w:right w:val="single" w:color="CCCCCC" w:sz="6"/>
+            </w:tcBorders>
+            <w:shd w:fill="F0F0F0" w:val="clear"/>
+            <w:tcMar>
+              <w:top w:type="dxa" w:w="80"/>
+              <w:left w:type="dxa" w:w="120"/>
+              <w:bottom w:type="dxa" w:w="80"/>
+              <w:right w:type="dxa" w:w="120"/>
+            </w:tcMar>
+          </w:tcPr>
+          <w:p>
+            <w:pPr>
+              <w:jc w:val="center"/>
+            </w:pPr>
+            <w:r>
+              <w:rPr>
+                <w:rFonts w:ascii="微软雅黑" w:cs="微软雅黑" w:eastAsia="微软雅黑" w:hAnsi="微软雅黑"/>
+                <w:b/>
+                <w:bCs/>
+                <w:sz w:val="20"/>
+                <w:szCs w:val="20"/>
+              </w:rPr>
+              <w:t xml:space="preserve">第一位（今日推荐）</w:t>
+            </w:r>
+          </w:p>
+        </w:tc>
+        <w:tc>
+          <w:tcPr>
+            <w:tcW w:type="dxa" w:w="2520"/>
+            <w:tcBorders>
+              <w:top w:val="single" w:color="CCCCCC" w:sz="6"/>
+              <w:left w:val="single" w:color="CCCCCC" w:sz="6"/>
+              <w:bottom w:val="single" w:color="CCCCCC" w:sz="6"/>
+              <w:right w:val="single" w:color="CCCCCC" w:sz="6"/>
+            </w:tcBorders>
+            <w:shd w:fill="F0F0F0" w:val="clear"/>
+            <w:tcMar>
+              <w:top w:type="dxa" w:w="80"/>
+              <w:left w:type="dxa" w:w="120"/>
+              <w:bottom w:type="dxa" w:w="80"/>
+              <w:right w:type="dxa" w:w="120"/>
+            </w:tcMar>
+          </w:tcPr>
+          <w:p>
+            <w:pPr>
+              <w:jc w:val="center"/>
+            </w:pPr>
+            <w:r>
+              <w:rPr>
+                <w:rFonts w:ascii="微软雅黑" w:cs="微软雅黑" w:eastAsia="微软雅黑" w:hAnsi="微软雅黑"/>
+                <w:b/>
+                <w:bCs/>
+                <w:sz w:val="20"/>
+                <w:szCs w:val="20"/>
+              </w:rPr>
+              <w:t xml:space="preserve">第二位</w:t>
+            </w:r>
+          </w:p>
+        </w:tc>
+        <w:tc>
+          <w:tcPr>
+            <w:tcW w:type="dxa" w:w="2520"/>
+            <w:tcBorders>
+              <w:top w:val="single" w:color="CCCCCC" w:sz="6"/>
+              <w:left w:val="single" w:color="CCCCCC" w:sz="6"/>
+              <w:bottom w:val="single" w:color="CCCCCC" w:sz="6"/>
+              <w:right w:val="single" w:color="CCCCCC" w:sz="6"/>
+            </w:tcBorders>
+            <w:shd w:fill="F0F0F0" w:val="clear"/>
+            <w:tcMar>
+              <w:top w:type="dxa" w:w="80"/>
+              <w:left w:type="dxa" w:w="120"/>
+              <w:bottom w:type="dxa" w:w="80"/>
+              <w:right w:type="dxa" w:w="120"/>
+            </w:tcMar>
+          </w:tcPr>
+          <w:p>
+            <w:pPr>
+              <w:jc w:val="center"/>
+            </w:pPr>
+            <w:r>
+              <w:rPr>
+                <w:rFonts w:ascii="微软雅黑" w:cs="微软雅黑" w:eastAsia="微软雅黑" w:hAnsi="微软雅黑"/>
+                <w:b/>
+                <w:bCs/>
+                <w:sz w:val="20"/>
+                <w:szCs w:val="20"/>
+              </w:rPr>
+              <w:t xml:space="preserve">第三位</w:t>
+            </w:r>
+          </w:p>
+        </w:tc>
+      </w:tr>
+      <w:tr>
+        <w:tc>
+          <w:tcPr>
+            <w:tcW w:type="dxa" w:w="1560"/>
+            <w:tcBorders>
+              <w:top w:val="single" w:color="CCCCCC" w:sz="6"/>
+              <w:left w:val="single" w:color="CCCCCC" w:sz="6"/>
+              <w:bottom w:val="single" w:color="CCCCCC" w:sz="6"/>
+              <w:right w:val="single" w:color="CCCCCC" w:sz="6"/>
+            </w:tcBorders>
+            <w:tcMar>
+              <w:top w:type="dxa" w:w="80"/>
+              <w:left w:type="dxa" w:w="120"/>
+              <w:bottom w:type="dxa" w:w="80"/>
+              <w:right w:type="dxa" w:w="120"/>
+            </w:tcMar>
+          </w:tcPr>
+          <w:p>
+            <w:pPr>
+              <w:jc w:val="center"/>
+            </w:pPr>
+            <w:r>
+              <w:rPr>
+                <w:rFonts w:ascii="微软雅黑" w:cs="微软雅黑" w:eastAsia="微软雅黑" w:hAnsi="微软雅黑"/>
+                <w:b/>
+                <w:bCs/>
+                <w:sz w:val="20"/>
+                <w:szCs w:val="20"/>
+              </w:rPr>
+              <w:t xml:space="preserve">第 1 天</w:t>
+            </w:r>
+          </w:p>
+        </w:tc>
+        <w:tc>
+          <w:tcPr>
+            <w:tcW w:type="dxa" w:w="2520"/>
+            <w:tcBorders>
+              <w:top w:val="single" w:color="CCCCCC" w:sz="6"/>
+              <w:left w:val="single" w:color="CCCCCC" w:sz="6"/>
+              <w:bottom w:val="single" w:color="CCCCCC" w:sz="6"/>
+              <w:right w:val="single" w:color="CCCCCC" w:sz="6"/>
+            </w:tcBorders>
+            <w:tcMar>
+              <w:top w:type="dxa" w:w="80"/>
+              <w:left w:type="dxa" w:w="120"/>
+              <w:bottom w:type="dxa" w:w="80"/>
+              <w:right w:type="dxa" w:w="120"/>
+            </w:tcMar>
+          </w:tcPr>
+          <w:p>
+            <w:pPr>
+              <w:jc w:val="center"/>
+            </w:pPr>
+            <w:r>
+              <w:rPr>
+                <w:rFonts w:ascii="微软雅黑" w:cs="微软雅黑" w:eastAsia="微软雅黑" w:hAnsi="微软雅黑"/>
+                <w:b/>
+                <w:bCs/>
+                <w:color w:val="D4A017"/>
+                <w:sz w:val="20"/>
+                <w:szCs w:val="20"/>
+              </w:rPr>
+              <w:t xml:space="preserve">华夏</w:t>
+            </w:r>
+          </w:p>
+        </w:tc>
+        <w:tc>
+          <w:tcPr>
+            <w:tcW w:type="dxa" w:w="2520"/>
+            <w:tcBorders>
+              <w:top w:val="single" w:color="CCCCCC" w:sz="6"/>
+              <w:left w:val="single" w:color="CCCCCC" w:sz="6"/>
+              <w:bottom w:val="single" w:color="CCCCCC" w:sz="6"/>
+              <w:right w:val="single" w:color="CCCCCC" w:sz="6"/>
+            </w:tcBorders>
+            <w:tcMar>
+              <w:top w:type="dxa" w:w="80"/>
+              <w:left w:type="dxa" w:w="120"/>
+              <w:bottom w:type="dxa" w:w="80"/>
+              <w:right w:type="dxa" w:w="120"/>
+            </w:tcMar>
+          </w:tcPr>
+          <w:p>
+            <w:pPr>
+              <w:jc w:val="center"/>
+            </w:pPr>
+            <w:r>
+              <w:rPr>
+                <w:rFonts w:ascii="微软雅黑" w:cs="微软雅黑" w:eastAsia="微软雅黑" w:hAnsi="微软雅黑"/>
+                <w:sz w:val="20"/>
+                <w:szCs w:val="20"/>
+              </w:rPr>
+              <w:t xml:space="preserve">易方达</w:t>
+            </w:r>
+          </w:p>
+        </w:tc>
+        <w:tc>
+          <w:tcPr>
+            <w:tcW w:type="dxa" w:w="2520"/>
+            <w:tcBorders>
+              <w:top w:val="single" w:color="CCCCCC" w:sz="6"/>
+              <w:left w:val="single" w:color="CCCCCC" w:sz="6"/>
+              <w:bottom w:val="single" w:color="CCCCCC" w:sz="6"/>
+              <w:right w:val="single" w:color="CCCCCC" w:sz="6"/>
+            </w:tcBorders>
+            <w:tcMar>
+              <w:top w:type="dxa" w:w="80"/>
+              <w:left w:type="dxa" w:w="120"/>
+              <w:bottom w:type="dxa" w:w="80"/>
+              <w:right w:type="dxa" w:w="120"/>
+            </w:tcMar>
+          </w:tcPr>
+          <w:p>
+            <w:pPr>
+              <w:jc w:val="center"/>
+            </w:pPr>
+            <w:r>
+              <w:rPr>
+                <w:rFonts w:ascii="微软雅黑" w:cs="微软雅黑" w:eastAsia="微软雅黑" w:hAnsi="微软雅黑"/>
+                <w:sz w:val="20"/>
+                <w:szCs w:val="20"/>
+              </w:rPr>
+              <w:t xml:space="preserve">富国</w:t>
+            </w:r>
+          </w:p>
+        </w:tc>
+      </w:tr>
+      <w:tr>
+        <w:tc>
+          <w:tcPr>
+            <w:tcW w:type="dxa" w:w="1560"/>
+            <w:tcBorders>
+              <w:top w:val="single" w:color="CCCCCC" w:sz="6"/>
+              <w:left w:val="single" w:color="CCCCCC" w:sz="6"/>
+              <w:bottom w:val="single" w:color="CCCCCC" w:sz="6"/>
+              <w:right w:val="single" w:color="CCCCCC" w:sz="6"/>
+            </w:tcBorders>
+            <w:tcMar>
+              <w:top w:type="dxa" w:w="80"/>
+              <w:left w:type="dxa" w:w="120"/>
+              <w:bottom w:type="dxa" w:w="80"/>
+              <w:right w:type="dxa" w:w="120"/>
+            </w:tcMar>
+          </w:tcPr>
+          <w:p>
+            <w:pPr>
+              <w:jc w:val="center"/>
+            </w:pPr>
+            <w:r>
+              <w:rPr>
+                <w:rFonts w:ascii="微软雅黑" w:cs="微软雅黑" w:eastAsia="微软雅黑" w:hAnsi="微软雅黑"/>
+                <w:b/>
+                <w:bCs/>
+                <w:sz w:val="20"/>
+                <w:szCs w:val="20"/>
+              </w:rPr>
+              <w:t xml:space="preserve">第 2 天</w:t>
+            </w:r>
+          </w:p>
+        </w:tc>
+        <w:tc>
+          <w:tcPr>
+            <w:tcW w:type="dxa" w:w="2520"/>
+            <w:tcBorders>
+              <w:top w:val="single" w:color="CCCCCC" w:sz="6"/>
+              <w:left w:val="single" w:color="CCCCCC" w:sz="6"/>
+              <w:bottom w:val="single" w:color="CCCCCC" w:sz="6"/>
+              <w:right w:val="single" w:color="CCCCCC" w:sz="6"/>
+            </w:tcBorders>
+            <w:tcMar>
+              <w:top w:type="dxa" w:w="80"/>
+              <w:left w:type="dxa" w:w="120"/>
+              <w:bottom w:type="dxa" w:w="80"/>
+              <w:right w:type="dxa" w:w="120"/>
+            </w:tcMar>
+          </w:tcPr>
+          <w:p>
+            <w:pPr>
+              <w:jc w:val="center"/>
+            </w:pPr>
+            <w:r>
+              <w:rPr>
+                <w:rFonts w:ascii="微软雅黑" w:cs="微软雅黑" w:eastAsia="微软雅黑" w:hAnsi="微软雅黑"/>
+                <w:b/>
+                <w:bCs/>
+                <w:color w:val="D4A017"/>
+                <w:sz w:val="20"/>
+                <w:szCs w:val="20"/>
+              </w:rPr>
+              <w:t xml:space="preserve">易方达</w:t>
+            </w:r>
+          </w:p>
+        </w:tc>
+        <w:tc>
+          <w:tcPr>
+            <w:tcW w:type="dxa" w:w="2520"/>
+            <w:tcBorders>
+              <w:top w:val="single" w:color="CCCCCC" w:sz="6"/>
+              <w:left w:val="single" w:color="CCCCCC" w:sz="6"/>
+              <w:bottom w:val="single" w:color="CCCCCC" w:sz="6"/>
+              <w:right w:val="single" w:color="CCCCCC" w:sz="6"/>
+            </w:tcBorders>
+            <w:tcMar>
+              <w:top w:type="dxa" w:w="80"/>
+              <w:left w:type="dxa" w:w="120"/>
+              <w:bottom w:type="dxa" w:w="80"/>
+              <w:right w:type="dxa" w:w="120"/>
+            </w:tcMar>
+          </w:tcPr>
+          <w:p>
+            <w:pPr>
+              <w:jc w:val="center"/>
+            </w:pPr>
+            <w:r>
+              <w:rPr>
+                <w:rFonts w:ascii="微软雅黑" w:cs="微软雅黑" w:eastAsia="微软雅黑" w:hAnsi="微软雅黑"/>
+                <w:sz w:val="20"/>
+                <w:szCs w:val="20"/>
+              </w:rPr>
+              <w:t xml:space="preserve">富国</w:t>
+            </w:r>
+          </w:p>
+        </w:tc>
+        <w:tc>
+          <w:tcPr>
+            <w:tcW w:type="dxa" w:w="2520"/>
+            <w:tcBorders>
+              <w:top w:val="single" w:color="CCCCCC" w:sz="6"/>
+              <w:left w:val="single" w:color="CCCCCC" w:sz="6"/>
+              <w:bottom w:val="single" w:color="CCCCCC" w:sz="6"/>
+              <w:right w:val="single" w:color="CCCCCC" w:sz="6"/>
+            </w:tcBorders>
+            <w:tcMar>
+              <w:top w:type="dxa" w:w="80"/>
+              <w:left w:type="dxa" w:w="120"/>
+              <w:bottom w:type="dxa" w:w="80"/>
+              <w:right w:type="dxa" w:w="120"/>
+            </w:tcMar>
+          </w:tcPr>
+          <w:p>
+            <w:pPr>
+              <w:jc w:val="center"/>
+            </w:pPr>
+            <w:r>
+              <w:rPr>
+                <w:rFonts w:ascii="微软雅黑" w:cs="微软雅黑" w:eastAsia="微软雅黑" w:hAnsi="微软雅黑"/>
+                <w:sz w:val="20"/>
+                <w:szCs w:val="20"/>
+              </w:rPr>
+              <w:t xml:space="preserve">华夏</w:t>
+            </w:r>
+          </w:p>
+        </w:tc>
+      </w:tr>
+      <w:tr>
+        <w:tc>
+          <w:tcPr>
+            <w:tcW w:type="dxa" w:w="1560"/>
+            <w:tcBorders>
+              <w:top w:val="single" w:color="CCCCCC" w:sz="6"/>
+              <w:left w:val="single" w:color="CCCCCC" w:sz="6"/>
+              <w:bottom w:val="single" w:color="CCCCCC" w:sz="6"/>
+              <w:right w:val="single" w:color="CCCCCC" w:sz="6"/>
+            </w:tcBorders>
+            <w:tcMar>
+              <w:top w:type="dxa" w:w="80"/>
+              <w:left w:type="dxa" w:w="120"/>
+              <w:bottom w:type="dxa" w:w="80"/>
+              <w:right w:type="dxa" w:w="120"/>
+            </w:tcMar>
+          </w:tcPr>
+          <w:p>
+            <w:pPr>
+              <w:jc w:val="center"/>
+            </w:pPr>
+            <w:r>
+              <w:rPr>
+                <w:rFonts w:ascii="微软雅黑" w:cs="微软雅黑" w:eastAsia="微软雅黑" w:hAnsi="微软雅黑"/>
+                <w:b/>
+                <w:bCs/>
+                <w:sz w:val="20"/>
+                <w:szCs w:val="20"/>
+              </w:rPr>
+              <w:t xml:space="preserve">第 3 天</w:t>
+            </w:r>
+          </w:p>
+        </w:tc>
+        <w:tc>
+          <w:tcPr>
+            <w:tcW w:type="dxa" w:w="2520"/>
+            <w:tcBorders>
+              <w:top w:val="single" w:color="CCCCCC" w:sz="6"/>
+              <w:left w:val="single" w:color="CCCCCC" w:sz="6"/>
+              <w:bottom w:val="single" w:color="CCCCCC" w:sz="6"/>
+              <w:right w:val="single" w:color="CCCCCC" w:sz="6"/>
+            </w:tcBorders>
+            <w:tcMar>
+              <w:top w:type="dxa" w:w="80"/>
+              <w:left w:type="dxa" w:w="120"/>
+              <w:bottom w:type="dxa" w:w="80"/>
+              <w:right w:type="dxa" w:w="120"/>
+            </w:tcMar>
+          </w:tcPr>
+          <w:p>
+            <w:pPr>
+              <w:jc w:val="center"/>
+            </w:pPr>
+            <w:r>
+              <w:rPr>
+                <w:rFonts w:ascii="微软雅黑" w:cs="微软雅黑" w:eastAsia="微软雅黑" w:hAnsi="微软雅黑"/>
+                <w:b/>
+                <w:bCs/>
+                <w:color w:val="D4A017"/>
+                <w:sz w:val="20"/>
+                <w:szCs w:val="20"/>
+              </w:rPr>
+              <w:t xml:space="preserve">富国</w:t>
+            </w:r>
+          </w:p>
+        </w:tc>
+        <w:tc>
+          <w:tcPr>
+            <w:tcW w:type="dxa" w:w="2520"/>
+            <w:tcBorders>
+              <w:top w:val="single" w:color="CCCCCC" w:sz="6"/>
+              <w:left w:val="single" w:color="CCCCCC" w:sz="6"/>
+              <w:bottom w:val="single" w:color="CCCCCC" w:sz="6"/>
+              <w:right w:val="single" w:color="CCCCCC" w:sz="6"/>
+            </w:tcBorders>
+            <w:tcMar>
+              <w:top w:type="dxa" w:w="80"/>
+              <w:left w:type="dxa" w:w="120"/>
+              <w:bottom w:type="dxa" w:w="80"/>
+              <w:right w:type="dxa" w:w="120"/>
+            </w:tcMar>
+          </w:tcPr>
+          <w:p>
+            <w:pPr>
+              <w:jc w:val="center"/>
+            </w:pPr>
+            <w:r>
+              <w:rPr>
+                <w:rFonts w:ascii="微软雅黑" w:cs="微软雅黑" w:eastAsia="微软雅黑" w:hAnsi="微软雅黑"/>
+                <w:sz w:val="20"/>
+                <w:szCs w:val="20"/>
+              </w:rPr>
+              <w:t xml:space="preserve">华夏</w:t>
+            </w:r>
+          </w:p>
+        </w:tc>
+        <w:tc>
+          <w:tcPr>
+            <w:tcW w:type="dxa" w:w="2520"/>
+            <w:tcBorders>
+              <w:top w:val="single" w:color="CCCCCC" w:sz="6"/>
+              <w:left w:val="single" w:color="CCCCCC" w:sz="6"/>
+              <w:bottom w:val="single" w:color="CCCCCC" w:sz="6"/>
+              <w:right w:val="single" w:color="CCCCCC" w:sz="6"/>
+            </w:tcBorders>
+            <w:tcMar>
+              <w:top w:type="dxa" w:w="80"/>
+              <w:left w:type="dxa" w:w="120"/>
+              <w:bottom w:type="dxa" w:w="80"/>
+              <w:right w:type="dxa" w:w="120"/>
+            </w:tcMar>
+          </w:tcPr>
+          <w:p>
+            <w:pPr>
+              <w:jc w:val="center"/>
+            </w:pPr>
+            <w:r>
+              <w:rPr>
+                <w:rFonts w:ascii="微软雅黑" w:cs="微软雅黑" w:eastAsia="微软雅黑" w:hAnsi="微软雅黑"/>
+                <w:sz w:val="20"/>
+                <w:szCs w:val="20"/>
+              </w:rPr>
+              <w:t xml:space="preserve">易方达</w:t>
+            </w:r>
+          </w:p>
+        </w:tc>
+      </w:tr>
+      <w:tr>
+        <w:tc>
+          <w:tcPr>
+            <w:tcW w:type="dxa" w:w="1560"/>
+            <w:tcBorders>
+              <w:top w:val="single" w:color="CCCCCC" w:sz="6"/>
+              <w:left w:val="single" w:color="CCCCCC" w:sz="6"/>
+              <w:bottom w:val="single" w:color="CCCCCC" w:sz="6"/>
+              <w:right w:val="single" w:color="CCCCCC" w:sz="6"/>
+            </w:tcBorders>
+            <w:tcMar>
+              <w:top w:type="dxa" w:w="80"/>
+              <w:left w:type="dxa" w:w="120"/>
+              <w:bottom w:type="dxa" w:w="80"/>
+              <w:right w:type="dxa" w:w="120"/>
+            </w:tcMar>
+          </w:tcPr>
+          <w:p>
+            <w:pPr>
+              <w:jc w:val="center"/>
+            </w:pPr>
+            <w:r>
+              <w:rPr>
+                <w:rFonts w:ascii="微软雅黑" w:cs="微软雅黑" w:eastAsia="微软雅黑" w:hAnsi="微软雅黑"/>
+                <w:b/>
+                <w:bCs/>
+                <w:sz w:val="20"/>
+                <w:szCs w:val="20"/>
+              </w:rPr>
+              <w:t xml:space="preserve">第 4 天</w:t>
+            </w:r>
+          </w:p>
+        </w:tc>
+        <w:tc>
+          <w:tcPr>
+            <w:tcW w:type="dxa" w:w="7560"/>
+            <w:tcBorders>
+              <w:top w:val="single" w:color="CCCCCC" w:sz="6"/>
+              <w:left w:val="single" w:color="CCCCCC" w:sz="6"/>
+              <w:bottom w:val="single" w:color="CCCCCC" w:sz="6"/>
+              <w:right w:val="single" w:color="CCCCCC" w:sz="6"/>
+            </w:tcBorders>
+            <w:tcMar>
+              <w:top w:type="dxa" w:w="80"/>
+              <w:left w:type="dxa" w:w="120"/>
+              <w:bottom w:type="dxa" w:w="80"/>
+              <w:right w:type="dxa" w:w="120"/>
+            </w:tcMar>
+          </w:tcPr>
+          <w:p>
+            <w:pPr>
+              <w:jc w:val="center"/>
+            </w:pPr>
+            <w:r>
+              <w:rPr>
+                <w:rFonts w:ascii="微软雅黑" w:cs="微软雅黑" w:eastAsia="微软雅黑" w:hAnsi="微软雅黑"/>
+                <w:color w:val="999999"/>
+                <w:sz w:val="20"/>
+                <w:szCs w:val="20"/>
+              </w:rPr>
+              <w:t xml:space="preserve">（回到第 1 天，循环往复）</w:t>
+            </w:r>
+          </w:p>
+        </w:tc>
+      </w:tr>
+    </w:tbl>
     <w:p>
       <w:pPr>
         <w:pStyle w:val="Heading3"/>
@@ -2897,46 +3592,79 @@
           <w:sz w:val="22"/>
           <w:szCs w:val="22"/>
         </w:rPr>
-        <w:t xml:space="preserve">当前轮值名单</w:t>
-      </w:r>
-    </w:p>
-    <w:p>
-      <w:pPr>
-        <w:pStyle w:val="ListParagraph"/>
-        <w:numPr>
-          <w:ilvl w:val="0"/>
-          <w:numId w:val="2"/>
-        </w:numPr>
-        <w:spacing w:after="80"/>
-      </w:pPr>
-      <w:r>
-        <w:rPr>
-          <w:rFonts w:ascii="微软雅黑" w:cs="微软雅黑" w:eastAsia="微软雅黑" w:hAnsi="微软雅黑"/>
-          <w:sz w:val="22"/>
-          <w:szCs w:val="22"/>
-        </w:rPr>
-        <w:t xml:space="preserve">华夏基金 / 富国基金 / 易方达基金 / 华安基金 / 华宝基金 / 华泰柏瑞 / 嘉实基金（7 家，可扩展）</w:t>
-      </w:r>
-    </w:p>
-    <w:p>
-      <w:pPr>
-        <w:spacing w:after="100"/>
-        <w:rPr>
-          <w:i/>
-          <w:iCs/>
-          <w:color w:val="666666"/>
-        </w:rPr>
-      </w:pPr>
-      <w:r>
-        <w:rPr>
-          <w:rFonts w:ascii="微软雅黑" w:cs="微软雅黑" w:eastAsia="微软雅黑" w:hAnsi="微软雅黑"/>
-          <w:i/>
-          <w:iCs/>
-          <w:color w:val="666666"/>
-          <w:sz w:val="22"/>
-          <w:szCs w:val="22"/>
-        </w:rPr>
-        <w:t xml:space="preserve">💡 名单顺序、轮值天数都可配置。一家公司想买"周一+周三+周五"专属位也支持。</w:t>
+        <w:t xml:space="preserve">计价建议</w:t>
+      </w:r>
+    </w:p>
+    <w:p>
+      <w:pPr>
+        <w:pStyle w:val="ListParagraph"/>
+        <w:numPr>
+          <w:ilvl w:val="0"/>
+          <w:numId w:val="2"/>
+        </w:numPr>
+        <w:spacing w:after="80"/>
+      </w:pPr>
+      <w:r>
+        <w:rPr>
+          <w:rFonts w:ascii="微软雅黑" w:cs="微软雅黑" w:eastAsia="微软雅黑" w:hAnsi="微软雅黑"/>
+          <w:sz w:val="22"/>
+          <w:szCs w:val="22"/>
+        </w:rPr>
+        <w:t xml:space="preserve">轮转头牌位是核心商业化资源 —— 每个签约客户都能轮到"第一位"曝光，公平且稀缺</w:t>
+      </w:r>
+    </w:p>
+    <w:p>
+      <w:pPr>
+        <w:pStyle w:val="ListParagraph"/>
+        <w:numPr>
+          <w:ilvl w:val="0"/>
+          <w:numId w:val="2"/>
+        </w:numPr>
+        <w:spacing w:after="80"/>
+      </w:pPr>
+      <w:r>
+        <w:rPr>
+          <w:rFonts w:ascii="微软雅黑" w:cs="微软雅黑" w:eastAsia="微软雅黑" w:hAnsi="微软雅黑"/>
+          <w:sz w:val="22"/>
+          <w:szCs w:val="22"/>
+        </w:rPr>
+        <w:t xml:space="preserve">客户数越少，每家轮到"第一位"的频次越高（如 3 家签约 = 每 3 天轮到 1 次第一位）</w:t>
+      </w:r>
+    </w:p>
+    <w:p>
+      <w:pPr>
+        <w:pStyle w:val="ListParagraph"/>
+        <w:numPr>
+          <w:ilvl w:val="0"/>
+          <w:numId w:val="2"/>
+        </w:numPr>
+        <w:spacing w:after="80"/>
+      </w:pPr>
+      <w:r>
+        <w:rPr>
+          <w:rFonts w:ascii="微软雅黑" w:cs="微软雅黑" w:eastAsia="微软雅黑" w:hAnsi="微软雅黑"/>
+          <w:sz w:val="22"/>
+          <w:szCs w:val="22"/>
+        </w:rPr>
+        <w:t xml:space="preserve">建议按"签约席位数"定价：席位越少单价越高（稀缺性溢价）</w:t>
+      </w:r>
+    </w:p>
+    <w:p>
+      <w:pPr>
+        <w:pStyle w:val="ListParagraph"/>
+        <w:numPr>
+          <w:ilvl w:val="0"/>
+          <w:numId w:val="2"/>
+        </w:numPr>
+        <w:spacing w:after="80"/>
+      </w:pPr>
+      <w:r>
+        <w:rPr>
+          <w:rFonts w:ascii="微软雅黑" w:cs="微软雅黑" w:eastAsia="微软雅黑" w:hAnsi="微软雅黑"/>
+          <w:sz w:val="22"/>
+          <w:szCs w:val="22"/>
+        </w:rPr>
+        <w:t xml:space="preserve">名单顺序、轮转周期均可由运营后台配置</w:t>
       </w:r>
     </w:p>
     <w:p>
@@ -4898,7 +5626,7 @@
           <w:sz w:val="22"/>
           <w:szCs w:val="22"/>
         </w:rPr>
-        <w:t xml:space="preserve">日轮动机制 + 今日推荐徽章</w:t>
+        <w:t xml:space="preserve">招商跑马灯轮转头牌位 + 今日推荐徽章</w:t>
       </w:r>
     </w:p>
     <w:p>
@@ -5430,7 +6158,7 @@
                 <w:sz w:val="20"/>
                 <w:szCs w:val="20"/>
               </w:rPr>
-              <w:t xml:space="preserve">当前 ETF 池规模</w:t>
+              <w:t xml:space="preserve">当前演示池规模</w:t>
             </w:r>
           </w:p>
         </w:tc>
@@ -5460,7 +6188,7 @@
                 <w:sz w:val="20"/>
                 <w:szCs w:val="20"/>
               </w:rPr>
-              <w:t xml:space="preserve">27 只（前 8 + 中 8 + 后 6 + 门 5）</w:t>
+              <w:t xml:space="preserve">30 只（前 9 + 中 9 + 后 7 + 门 5）；后台名单约 40-50 只</w:t>
             </w:r>
           </w:p>
         </w:tc>
@@ -5554,7 +6282,7 @@
                 <w:sz w:val="20"/>
                 <w:szCs w:val="20"/>
               </w:rPr>
-              <w:t xml:space="preserve">招商客户轮值容量</w:t>
+              <w:t xml:space="preserve">招商轮转机制</w:t>
             </w:r>
           </w:p>
         </w:tc>
@@ -5584,7 +6312,69 @@
                 <w:sz w:val="20"/>
                 <w:szCs w:val="20"/>
               </w:rPr>
-              <w:t xml:space="preserve">7 家（可扩展）</w:t>
+              <w:t xml:space="preserve">跑马灯轮转头牌位，签约席位数可配置</w:t>
+            </w:r>
+          </w:p>
+        </w:tc>
+      </w:tr>
+      <w:tr>
+        <w:tc>
+          <w:tcPr>
+            <w:tcW w:type="dxa" w:w="2340"/>
+            <w:tcBorders>
+              <w:top w:val="single" w:color="CCCCCC" w:sz="6"/>
+              <w:left w:val="single" w:color="CCCCCC" w:sz="6"/>
+              <w:bottom w:val="single" w:color="CCCCCC" w:sz="6"/>
+              <w:right w:val="single" w:color="CCCCCC" w:sz="6"/>
+            </w:tcBorders>
+            <w:tcMar>
+              <w:top w:type="dxa" w:w="80"/>
+              <w:left w:type="dxa" w:w="120"/>
+              <w:bottom w:type="dxa" w:w="80"/>
+              <w:right w:type="dxa" w:w="120"/>
+            </w:tcMar>
+          </w:tcPr>
+          <w:p>
+            <w:pPr>
+              <w:jc w:val="left"/>
+            </w:pPr>
+            <w:r>
+              <w:rPr>
+                <w:rFonts w:ascii="微软雅黑" w:cs="微软雅黑" w:eastAsia="微软雅黑" w:hAnsi="微软雅黑"/>
+                <w:sz w:val="20"/>
+                <w:szCs w:val="20"/>
+              </w:rPr>
+              <w:t xml:space="preserve">开奖与通知</w:t>
+            </w:r>
+          </w:p>
+        </w:tc>
+        <w:tc>
+          <w:tcPr>
+            <w:tcW w:type="dxa" w:w="6900"/>
+            <w:tcBorders>
+              <w:top w:val="single" w:color="CCCCCC" w:sz="6"/>
+              <w:left w:val="single" w:color="CCCCCC" w:sz="6"/>
+              <w:bottom w:val="single" w:color="CCCCCC" w:sz="6"/>
+              <w:right w:val="single" w:color="CCCCCC" w:sz="6"/>
+            </w:tcBorders>
+            <w:tcMar>
+              <w:top w:type="dxa" w:w="80"/>
+              <w:left w:type="dxa" w:w="120"/>
+              <w:bottom w:type="dxa" w:w="80"/>
+              <w:right w:type="dxa" w:w="120"/>
+            </w:tcMar>
+          </w:tcPr>
+          <w:p>
+            <w:pPr>
+              <w:jc w:val="left"/>
+            </w:pPr>
+            <w:r>
+              <w:rPr>
+                <w:rFonts w:ascii="微软雅黑" w:cs="微软雅黑" w:eastAsia="微软雅黑" w:hAnsi="微软雅黑"/>
+                <w:sz w:val="20"/>
+                <w:szCs w:val="20"/>
+              </w:rPr>
+              <w:t xml:space="preserve">每日发帖公示名单 + 站内信实时通知获奖球友</w:t>
             </w:r>
           </w:p>
         </w:tc>

</xml_diff>

<commit_message>
Update activity dates to 6.12-7.20 + add prize quota rules
- Activity period: 2026.06.12 - 2026.07.20 (39 days)
- sponsorRotation.js ACTIVITY_START → 2026-06-12
- New 获奖名额规则: daily prize max 1/week per user (overflow顺延 to next),
  weekly prize max 1/whole-activity per user (repeat winner顺延 to runner-up)
- Updated both prize card footnotes + sponsorship doc section 3.3
</commit_message>
<xml_diff>
--- a/ETF球队老板H5招商说明书.docx
+++ b/ETF球队老板H5招商说明书.docx
@@ -1584,79 +1584,25 @@
           <w:sz w:val="26"/>
           <w:szCs w:val="26"/>
         </w:rPr>
-        <w:t xml:space="preserve">3.1 每日榜 TOP 5</w:t>
-      </w:r>
-    </w:p>
-    <w:p>
-      <w:pPr>
-        <w:pStyle w:val="ListParagraph"/>
-        <w:numPr>
-          <w:ilvl w:val="0"/>
-          <w:numId w:val="2"/>
-        </w:numPr>
-        <w:spacing w:after="80"/>
-      </w:pPr>
-      <w:r>
-        <w:rPr>
-          <w:rFonts w:ascii="微软雅黑" w:cs="微软雅黑" w:eastAsia="微软雅黑" w:hAnsi="微软雅黑"/>
-          <w:sz w:val="22"/>
-          <w:szCs w:val="22"/>
-        </w:rPr>
-        <w:t xml:space="preserve">结算节点：每日 24:00</w:t>
-      </w:r>
-    </w:p>
-    <w:p>
-      <w:pPr>
-        <w:pStyle w:val="ListParagraph"/>
-        <w:numPr>
-          <w:ilvl w:val="0"/>
-          <w:numId w:val="2"/>
-        </w:numPr>
-        <w:spacing w:after="80"/>
-      </w:pPr>
-      <w:r>
-        <w:rPr>
-          <w:rFonts w:ascii="微软雅黑" w:cs="微软雅黑" w:eastAsia="微软雅黑" w:hAnsi="微软雅黑"/>
-          <w:sz w:val="22"/>
-          <w:szCs w:val="22"/>
-        </w:rPr>
-        <w:t xml:space="preserve">计票口径：当日在雪球活动主贴下用户海报跟帖的点赞数</w:t>
-      </w:r>
-    </w:p>
-    <w:p>
-      <w:pPr>
-        <w:pStyle w:val="ListParagraph"/>
-        <w:numPr>
-          <w:ilvl w:val="0"/>
-          <w:numId w:val="2"/>
-        </w:numPr>
-        <w:spacing w:after="80"/>
-      </w:pPr>
-      <w:r>
-        <w:rPr>
-          <w:rFonts w:ascii="微软雅黑" w:cs="微软雅黑" w:eastAsia="微软雅黑" w:hAnsi="微软雅黑"/>
-          <w:sz w:val="22"/>
-          <w:szCs w:val="22"/>
-        </w:rPr>
-        <w:t xml:space="preserve">奖品：雪球品牌棒球帽 × 1 顶</w:t>
-      </w:r>
-    </w:p>
-    <w:p>
-      <w:pPr>
-        <w:pStyle w:val="ListParagraph"/>
-        <w:numPr>
-          <w:ilvl w:val="0"/>
-          <w:numId w:val="2"/>
-        </w:numPr>
-        <w:spacing w:after="80"/>
-      </w:pPr>
-      <w:r>
-        <w:rPr>
-          <w:rFonts w:ascii="微软雅黑" w:cs="微软雅黑" w:eastAsia="微软雅黑" w:hAnsi="微软雅黑"/>
-          <w:sz w:val="22"/>
-          <w:szCs w:val="22"/>
-        </w:rPr>
-        <w:t xml:space="preserve">每日 5 名得主，全期不累计</w:t>
+        <w:t xml:space="preserve">3.0 活动时间</w:t>
+      </w:r>
+    </w:p>
+    <w:p>
+      <w:pPr>
+        <w:pStyle w:val="ListParagraph"/>
+        <w:numPr>
+          <w:ilvl w:val="0"/>
+          <w:numId w:val="2"/>
+        </w:numPr>
+        <w:spacing w:after="80"/>
+      </w:pPr>
+      <w:r>
+        <w:rPr>
+          <w:rFonts w:ascii="微软雅黑" w:cs="微软雅黑" w:eastAsia="微软雅黑" w:hAnsi="微软雅黑"/>
+          <w:sz w:val="22"/>
+          <w:szCs w:val="22"/>
+        </w:rPr>
+        <w:t xml:space="preserve">2026.06.12 — 2026.07.20，共 39 天</w:t>
       </w:r>
     </w:p>
     <w:p>
@@ -1673,79 +1619,79 @@
           <w:sz w:val="26"/>
           <w:szCs w:val="26"/>
         </w:rPr>
-        <w:t xml:space="preserve">3.2 每周榜 TOP 1</w:t>
-      </w:r>
-    </w:p>
-    <w:p>
-      <w:pPr>
-        <w:pStyle w:val="ListParagraph"/>
-        <w:numPr>
-          <w:ilvl w:val="0"/>
-          <w:numId w:val="2"/>
-        </w:numPr>
-        <w:spacing w:after="80"/>
-      </w:pPr>
-      <w:r>
-        <w:rPr>
-          <w:rFonts w:ascii="微软雅黑" w:cs="微软雅黑" w:eastAsia="微软雅黑" w:hAnsi="微软雅黑"/>
-          <w:sz w:val="22"/>
-          <w:szCs w:val="22"/>
-        </w:rPr>
-        <w:t xml:space="preserve">结算节点：每周日 24:00</w:t>
-      </w:r>
-    </w:p>
-    <w:p>
-      <w:pPr>
-        <w:pStyle w:val="ListParagraph"/>
-        <w:numPr>
-          <w:ilvl w:val="0"/>
-          <w:numId w:val="2"/>
-        </w:numPr>
-        <w:spacing w:after="80"/>
-      </w:pPr>
-      <w:r>
-        <w:rPr>
-          <w:rFonts w:ascii="微软雅黑" w:cs="微软雅黑" w:eastAsia="微软雅黑" w:hAnsi="微软雅黑"/>
-          <w:sz w:val="22"/>
-          <w:szCs w:val="22"/>
-        </w:rPr>
-        <w:t xml:space="preserve">计票口径：本周累计点赞数</w:t>
-      </w:r>
-    </w:p>
-    <w:p>
-      <w:pPr>
-        <w:pStyle w:val="ListParagraph"/>
-        <w:numPr>
-          <w:ilvl w:val="0"/>
-          <w:numId w:val="2"/>
-        </w:numPr>
-        <w:spacing w:after="80"/>
-      </w:pPr>
-      <w:r>
-        <w:rPr>
-          <w:rFonts w:ascii="微软雅黑" w:cs="微软雅黑" w:eastAsia="微软雅黑" w:hAnsi="微软雅黑"/>
-          <w:sz w:val="22"/>
-          <w:szCs w:val="22"/>
-        </w:rPr>
-        <w:t xml:space="preserve">奖品：雪球品牌白酒 × 1 瓶</w:t>
-      </w:r>
-    </w:p>
-    <w:p>
-      <w:pPr>
-        <w:pStyle w:val="ListParagraph"/>
-        <w:numPr>
-          <w:ilvl w:val="0"/>
-          <w:numId w:val="2"/>
-        </w:numPr>
-        <w:spacing w:after="80"/>
-      </w:pPr>
-      <w:r>
-        <w:rPr>
-          <w:rFonts w:ascii="微软雅黑" w:cs="微软雅黑" w:eastAsia="微软雅黑" w:hAnsi="微软雅黑"/>
-          <w:sz w:val="22"/>
-          <w:szCs w:val="22"/>
-        </w:rPr>
-        <w:t xml:space="preserve">每周开奖 1 名，与每日奖可叠加</w:t>
+        <w:t xml:space="preserve">3.1 每日榜 TOP 5</w:t>
+      </w:r>
+    </w:p>
+    <w:p>
+      <w:pPr>
+        <w:pStyle w:val="ListParagraph"/>
+        <w:numPr>
+          <w:ilvl w:val="0"/>
+          <w:numId w:val="2"/>
+        </w:numPr>
+        <w:spacing w:after="80"/>
+      </w:pPr>
+      <w:r>
+        <w:rPr>
+          <w:rFonts w:ascii="微软雅黑" w:cs="微软雅黑" w:eastAsia="微软雅黑" w:hAnsi="微软雅黑"/>
+          <w:sz w:val="22"/>
+          <w:szCs w:val="22"/>
+        </w:rPr>
+        <w:t xml:space="preserve">结算节点：每日 24:00</w:t>
+      </w:r>
+    </w:p>
+    <w:p>
+      <w:pPr>
+        <w:pStyle w:val="ListParagraph"/>
+        <w:numPr>
+          <w:ilvl w:val="0"/>
+          <w:numId w:val="2"/>
+        </w:numPr>
+        <w:spacing w:after="80"/>
+      </w:pPr>
+      <w:r>
+        <w:rPr>
+          <w:rFonts w:ascii="微软雅黑" w:cs="微软雅黑" w:eastAsia="微软雅黑" w:hAnsi="微软雅黑"/>
+          <w:sz w:val="22"/>
+          <w:szCs w:val="22"/>
+        </w:rPr>
+        <w:t xml:space="preserve">计票口径：当日在雪球活动主贴下用户海报跟帖的点赞数</w:t>
+      </w:r>
+    </w:p>
+    <w:p>
+      <w:pPr>
+        <w:pStyle w:val="ListParagraph"/>
+        <w:numPr>
+          <w:ilvl w:val="0"/>
+          <w:numId w:val="2"/>
+        </w:numPr>
+        <w:spacing w:after="80"/>
+      </w:pPr>
+      <w:r>
+        <w:rPr>
+          <w:rFonts w:ascii="微软雅黑" w:cs="微软雅黑" w:eastAsia="微软雅黑" w:hAnsi="微软雅黑"/>
+          <w:sz w:val="22"/>
+          <w:szCs w:val="22"/>
+        </w:rPr>
+        <w:t xml:space="preserve">奖品：雪球品牌棒球帽 × 1 顶</w:t>
+      </w:r>
+    </w:p>
+    <w:p>
+      <w:pPr>
+        <w:pStyle w:val="ListParagraph"/>
+        <w:numPr>
+          <w:ilvl w:val="0"/>
+          <w:numId w:val="2"/>
+        </w:numPr>
+        <w:spacing w:after="80"/>
+      </w:pPr>
+      <w:r>
+        <w:rPr>
+          <w:rFonts w:ascii="微软雅黑" w:cs="微软雅黑" w:eastAsia="微软雅黑" w:hAnsi="微软雅黑"/>
+          <w:sz w:val="22"/>
+          <w:szCs w:val="22"/>
+        </w:rPr>
+        <w:t xml:space="preserve">每日 5 名得主</w:t>
       </w:r>
     </w:p>
     <w:p>
@@ -1762,61 +1708,79 @@
           <w:sz w:val="26"/>
           <w:szCs w:val="26"/>
         </w:rPr>
-        <w:t xml:space="preserve">3.3 点赞规则</w:t>
-      </w:r>
-    </w:p>
-    <w:p>
-      <w:pPr>
-        <w:pStyle w:val="ListParagraph"/>
-        <w:numPr>
-          <w:ilvl w:val="0"/>
-          <w:numId w:val="2"/>
-        </w:numPr>
-        <w:spacing w:after="80"/>
-      </w:pPr>
-      <w:r>
-        <w:rPr>
-          <w:rFonts w:ascii="微软雅黑" w:cs="微软雅黑" w:eastAsia="微软雅黑" w:hAnsi="微软雅黑"/>
-          <w:sz w:val="22"/>
-          <w:szCs w:val="22"/>
-        </w:rPr>
-        <w:t xml:space="preserve">所有点赞均发生在雪球活动主贴评论区，认用户海报跟帖的点赞数</w:t>
-      </w:r>
-    </w:p>
-    <w:p>
-      <w:pPr>
-        <w:pStyle w:val="ListParagraph"/>
-        <w:numPr>
-          <w:ilvl w:val="0"/>
-          <w:numId w:val="2"/>
-        </w:numPr>
-        <w:spacing w:after="80"/>
-      </w:pPr>
-      <w:r>
-        <w:rPr>
-          <w:rFonts w:ascii="微软雅黑" w:cs="微软雅黑" w:eastAsia="微软雅黑" w:hAnsi="微软雅黑"/>
-          <w:sz w:val="22"/>
-          <w:szCs w:val="22"/>
-        </w:rPr>
-        <w:t xml:space="preserve">每个用户每天最多为同一条海报点赞 1 次</w:t>
-      </w:r>
-    </w:p>
-    <w:p>
-      <w:pPr>
-        <w:pStyle w:val="ListParagraph"/>
-        <w:numPr>
-          <w:ilvl w:val="0"/>
-          <w:numId w:val="2"/>
-        </w:numPr>
-        <w:spacing w:after="80"/>
-      </w:pPr>
-      <w:r>
-        <w:rPr>
-          <w:rFonts w:ascii="微软雅黑" w:cs="微软雅黑" w:eastAsia="微软雅黑" w:hAnsi="微软雅黑"/>
-          <w:sz w:val="22"/>
-          <w:szCs w:val="22"/>
-        </w:rPr>
-        <w:t xml:space="preserve">检测到刷赞 / 小号互赞将取消评奖资格</w:t>
+        <w:t xml:space="preserve">3.2 每周榜 TOP 1</w:t>
+      </w:r>
+    </w:p>
+    <w:p>
+      <w:pPr>
+        <w:pStyle w:val="ListParagraph"/>
+        <w:numPr>
+          <w:ilvl w:val="0"/>
+          <w:numId w:val="2"/>
+        </w:numPr>
+        <w:spacing w:after="80"/>
+      </w:pPr>
+      <w:r>
+        <w:rPr>
+          <w:rFonts w:ascii="微软雅黑" w:cs="微软雅黑" w:eastAsia="微软雅黑" w:hAnsi="微软雅黑"/>
+          <w:sz w:val="22"/>
+          <w:szCs w:val="22"/>
+        </w:rPr>
+        <w:t xml:space="preserve">结算节点：每周日 24:00</w:t>
+      </w:r>
+    </w:p>
+    <w:p>
+      <w:pPr>
+        <w:pStyle w:val="ListParagraph"/>
+        <w:numPr>
+          <w:ilvl w:val="0"/>
+          <w:numId w:val="2"/>
+        </w:numPr>
+        <w:spacing w:after="80"/>
+      </w:pPr>
+      <w:r>
+        <w:rPr>
+          <w:rFonts w:ascii="微软雅黑" w:cs="微软雅黑" w:eastAsia="微软雅黑" w:hAnsi="微软雅黑"/>
+          <w:sz w:val="22"/>
+          <w:szCs w:val="22"/>
+        </w:rPr>
+        <w:t xml:space="preserve">计票口径：本周累计点赞数</w:t>
+      </w:r>
+    </w:p>
+    <w:p>
+      <w:pPr>
+        <w:pStyle w:val="ListParagraph"/>
+        <w:numPr>
+          <w:ilvl w:val="0"/>
+          <w:numId w:val="2"/>
+        </w:numPr>
+        <w:spacing w:after="80"/>
+      </w:pPr>
+      <w:r>
+        <w:rPr>
+          <w:rFonts w:ascii="微软雅黑" w:cs="微软雅黑" w:eastAsia="微软雅黑" w:hAnsi="微软雅黑"/>
+          <w:sz w:val="22"/>
+          <w:szCs w:val="22"/>
+        </w:rPr>
+        <w:t xml:space="preserve">奖品：雪球品牌白酒 × 1 瓶</w:t>
+      </w:r>
+    </w:p>
+    <w:p>
+      <w:pPr>
+        <w:pStyle w:val="ListParagraph"/>
+        <w:numPr>
+          <w:ilvl w:val="0"/>
+          <w:numId w:val="2"/>
+        </w:numPr>
+        <w:spacing w:after="80"/>
+      </w:pPr>
+      <w:r>
+        <w:rPr>
+          <w:rFonts w:ascii="微软雅黑" w:cs="微软雅黑" w:eastAsia="微软雅黑" w:hAnsi="微软雅黑"/>
+          <w:sz w:val="22"/>
+          <w:szCs w:val="22"/>
+        </w:rPr>
+        <w:t xml:space="preserve">每周开奖 1 名，与每日奖可叠加</w:t>
       </w:r>
     </w:p>
     <w:p>
@@ -1833,7 +1797,149 @@
           <w:sz w:val="26"/>
           <w:szCs w:val="26"/>
         </w:rPr>
-        <w:t xml:space="preserve">3.4 开奖与发奖通知</w:t>
+        <w:t xml:space="preserve">3.3 获奖名额规则</w:t>
+      </w:r>
+    </w:p>
+    <w:p>
+      <w:pPr>
+        <w:pStyle w:val="ListParagraph"/>
+        <w:numPr>
+          <w:ilvl w:val="0"/>
+          <w:numId w:val="2"/>
+        </w:numPr>
+        <w:spacing w:after="80"/>
+      </w:pPr>
+      <w:r>
+        <w:rPr>
+          <w:rFonts w:ascii="微软雅黑" w:cs="微软雅黑" w:eastAsia="微软雅黑" w:hAnsi="微软雅黑"/>
+          <w:sz w:val="22"/>
+          <w:szCs w:val="22"/>
+        </w:rPr>
+        <w:t xml:space="preserve">日度奖：同一用户每周最多获得 1 次。一周内多次进入日榜 TOP 5，从第 2 次起名额顺延给下一名；下一周重新计算，可再获 1 次</w:t>
+      </w:r>
+    </w:p>
+    <w:p>
+      <w:pPr>
+        <w:pStyle w:val="ListParagraph"/>
+        <w:numPr>
+          <w:ilvl w:val="0"/>
+          <w:numId w:val="2"/>
+        </w:numPr>
+        <w:spacing w:after="80"/>
+      </w:pPr>
+      <w:r>
+        <w:rPr>
+          <w:rFonts w:ascii="微软雅黑" w:cs="微软雅黑" w:eastAsia="微软雅黑" w:hAnsi="微软雅黑"/>
+          <w:sz w:val="22"/>
+          <w:szCs w:val="22"/>
+        </w:rPr>
+        <w:t xml:space="preserve">周度奖：同一用户在整个活动期内最多获得 1 次。若再次成为周榜第一，奖品顺延给第二名</w:t>
+      </w:r>
+    </w:p>
+    <w:p>
+      <w:pPr>
+        <w:pStyle w:val="ListParagraph"/>
+        <w:numPr>
+          <w:ilvl w:val="0"/>
+          <w:numId w:val="2"/>
+        </w:numPr>
+        <w:spacing w:after="80"/>
+      </w:pPr>
+      <w:r>
+        <w:rPr>
+          <w:rFonts w:ascii="微软雅黑" w:cs="微软雅黑" w:eastAsia="微软雅黑" w:hAnsi="微软雅黑"/>
+          <w:sz w:val="22"/>
+          <w:szCs w:val="22"/>
+        </w:rPr>
+        <w:t xml:space="preserve">日度奖与周度奖互不影响，可同时获得</w:t>
+      </w:r>
+    </w:p>
+    <w:p>
+      <w:pPr>
+        <w:pStyle w:val="Heading2"/>
+        <w:spacing w:after="160" w:before="280"/>
+      </w:pPr>
+      <w:r>
+        <w:rPr>
+          <w:rFonts w:ascii="微软雅黑" w:cs="微软雅黑" w:eastAsia="微软雅黑" w:hAnsi="微软雅黑"/>
+          <w:b/>
+          <w:bCs/>
+          <w:color w:val="0A0A0A"/>
+          <w:sz w:val="26"/>
+          <w:szCs w:val="26"/>
+        </w:rPr>
+        <w:t xml:space="preserve">3.4 点赞规则</w:t>
+      </w:r>
+    </w:p>
+    <w:p>
+      <w:pPr>
+        <w:pStyle w:val="ListParagraph"/>
+        <w:numPr>
+          <w:ilvl w:val="0"/>
+          <w:numId w:val="2"/>
+        </w:numPr>
+        <w:spacing w:after="80"/>
+      </w:pPr>
+      <w:r>
+        <w:rPr>
+          <w:rFonts w:ascii="微软雅黑" w:cs="微软雅黑" w:eastAsia="微软雅黑" w:hAnsi="微软雅黑"/>
+          <w:sz w:val="22"/>
+          <w:szCs w:val="22"/>
+        </w:rPr>
+        <w:t xml:space="preserve">所有点赞均发生在雪球活动主贴评论区，认用户海报跟帖的点赞数</w:t>
+      </w:r>
+    </w:p>
+    <w:p>
+      <w:pPr>
+        <w:pStyle w:val="ListParagraph"/>
+        <w:numPr>
+          <w:ilvl w:val="0"/>
+          <w:numId w:val="2"/>
+        </w:numPr>
+        <w:spacing w:after="80"/>
+      </w:pPr>
+      <w:r>
+        <w:rPr>
+          <w:rFonts w:ascii="微软雅黑" w:cs="微软雅黑" w:eastAsia="微软雅黑" w:hAnsi="微软雅黑"/>
+          <w:sz w:val="22"/>
+          <w:szCs w:val="22"/>
+        </w:rPr>
+        <w:t xml:space="preserve">每个用户每天最多为同一条海报点赞 1 次</w:t>
+      </w:r>
+    </w:p>
+    <w:p>
+      <w:pPr>
+        <w:pStyle w:val="ListParagraph"/>
+        <w:numPr>
+          <w:ilvl w:val="0"/>
+          <w:numId w:val="2"/>
+        </w:numPr>
+        <w:spacing w:after="80"/>
+      </w:pPr>
+      <w:r>
+        <w:rPr>
+          <w:rFonts w:ascii="微软雅黑" w:cs="微软雅黑" w:eastAsia="微软雅黑" w:hAnsi="微软雅黑"/>
+          <w:sz w:val="22"/>
+          <w:szCs w:val="22"/>
+        </w:rPr>
+        <w:t xml:space="preserve">检测到刷赞 / 小号互赞将取消评奖资格</w:t>
+      </w:r>
+    </w:p>
+    <w:p>
+      <w:pPr>
+        <w:pStyle w:val="Heading2"/>
+        <w:spacing w:after="160" w:before="280"/>
+      </w:pPr>
+      <w:r>
+        <w:rPr>
+          <w:rFonts w:ascii="微软雅黑" w:cs="微软雅黑" w:eastAsia="微软雅黑" w:hAnsi="微软雅黑"/>
+          <w:b/>
+          <w:bCs/>
+          <w:color w:val="0A0A0A"/>
+          <w:sz w:val="26"/>
+          <w:szCs w:val="26"/>
+        </w:rPr>
+        <w:t xml:space="preserve">3.5 开奖与发奖通知</w:t>
       </w:r>
     </w:p>
     <w:p>

</xml_diff>

<commit_message>
Poster polish + vendor product form + weekly swap mechanism
- Poster: remove top-right slogan badge, center the 雪球 logo
- Poster export: scale 1.5→2, fixed 480px width → 960px output (crisper, full-screen friendly)
- New deliverable: ETF厂商产品提报表.xlsx — vendor product submission template
  (instructions sheet + form sheet with position/risk dropdowns, example rows)
- Sponsorship doc: add section 4.4 售卖与产品更换机制 (10万/周, weekly product swap via vendor form, ops manual update)
</commit_message>
<xml_diff>
--- a/ETF球队老板H5招商说明书.docx
+++ b/ETF球队老板H5招商说明书.docx
@@ -3889,6 +3889,218 @@
           <w:szCs w:val="22"/>
         </w:rPr>
         <w:t xml:space="preserve">支持给每个招商客户生成独立的"带渠道追踪参数"的二维码，便于复盘</w:t>
+      </w:r>
+    </w:p>
+    <w:p>
+      <w:pPr>
+        <w:pStyle w:val="Heading2"/>
+        <w:spacing w:after="160" w:before="280"/>
+      </w:pPr>
+      <w:r>
+        <w:rPr>
+          <w:rFonts w:ascii="微软雅黑" w:cs="微软雅黑" w:eastAsia="微软雅黑" w:hAnsi="微软雅黑"/>
+          <w:b/>
+          <w:bCs/>
+          <w:color w:val="0A0A0A"/>
+          <w:sz w:val="26"/>
+          <w:szCs w:val="26"/>
+        </w:rPr>
+        <w:t xml:space="preserve">4.4 售卖与产品更换机制</w:t>
+      </w:r>
+    </w:p>
+    <w:p>
+      <w:pPr>
+        <w:pStyle w:val="Heading3"/>
+        <w:spacing w:after="120" w:before="220"/>
+      </w:pPr>
+      <w:r>
+        <w:rPr>
+          <w:rFonts w:ascii="微软雅黑" w:cs="微软雅黑" w:eastAsia="微软雅黑" w:hAnsi="微软雅黑"/>
+          <w:b/>
+          <w:bCs/>
+          <w:color w:val="2A85E0"/>
+          <w:sz w:val="22"/>
+          <w:szCs w:val="22"/>
+        </w:rPr>
+        <w:t xml:space="preserve">售卖单位</w:t>
+      </w:r>
+    </w:p>
+    <w:p>
+      <w:pPr>
+        <w:pStyle w:val="ListParagraph"/>
+        <w:numPr>
+          <w:ilvl w:val="0"/>
+          <w:numId w:val="2"/>
+        </w:numPr>
+        <w:spacing w:after="80"/>
+      </w:pPr>
+      <w:r>
+        <w:rPr>
+          <w:rFonts w:ascii="微软雅黑" w:cs="微软雅黑" w:eastAsia="微软雅黑" w:hAnsi="微软雅黑"/>
+          <w:sz w:val="22"/>
+          <w:szCs w:val="22"/>
+        </w:rPr>
+        <w:t xml:space="preserve">以「周」为售卖单位，参加 H5 的招商客户费用为 10 万元 / 周（参考价，最终以媒介报价为准）</w:t>
+      </w:r>
+    </w:p>
+    <w:p>
+      <w:pPr>
+        <w:pStyle w:val="ListParagraph"/>
+        <w:numPr>
+          <w:ilvl w:val="0"/>
+          <w:numId w:val="2"/>
+        </w:numPr>
+        <w:spacing w:after="80"/>
+      </w:pPr>
+      <w:r>
+        <w:rPr>
+          <w:rFonts w:ascii="微软雅黑" w:cs="微软雅黑" w:eastAsia="微软雅黑" w:hAnsi="微软雅黑"/>
+          <w:sz w:val="22"/>
+          <w:szCs w:val="22"/>
+        </w:rPr>
+        <w:t xml:space="preserve">客户可连续购买多周；多家客户同时在投时，通过跑马灯轮转公平分配头牌位</w:t>
+      </w:r>
+    </w:p>
+    <w:p>
+      <w:pPr>
+        <w:pStyle w:val="Heading3"/>
+        <w:spacing w:after="120" w:before="220"/>
+      </w:pPr>
+      <w:r>
+        <w:rPr>
+          <w:rFonts w:ascii="微软雅黑" w:cs="微软雅黑" w:eastAsia="微软雅黑" w:hAnsi="微软雅黑"/>
+          <w:b/>
+          <w:bCs/>
+          <w:color w:val="2A85E0"/>
+          <w:sz w:val="22"/>
+          <w:szCs w:val="22"/>
+        </w:rPr>
+        <w:t xml:space="preserve">每周换产品</w:t>
+      </w:r>
+    </w:p>
+    <w:p>
+      <w:pPr>
+        <w:pStyle w:val="ListParagraph"/>
+        <w:numPr>
+          <w:ilvl w:val="0"/>
+          <w:numId w:val="2"/>
+        </w:numPr>
+        <w:spacing w:after="80"/>
+      </w:pPr>
+      <w:r>
+        <w:rPr>
+          <w:rFonts w:ascii="微软雅黑" w:cs="微软雅黑" w:eastAsia="微软雅黑" w:hAnsi="微软雅黑"/>
+          <w:sz w:val="22"/>
+          <w:szCs w:val="22"/>
+        </w:rPr>
+        <w:t xml:space="preserve">客户每周可更换一批投放的 ETF 产品</w:t>
+      </w:r>
+    </w:p>
+    <w:p>
+      <w:pPr>
+        <w:pStyle w:val="ListParagraph"/>
+        <w:numPr>
+          <w:ilvl w:val="0"/>
+          <w:numId w:val="2"/>
+        </w:numPr>
+        <w:spacing w:after="80"/>
+      </w:pPr>
+      <w:r>
+        <w:rPr>
+          <w:rFonts w:ascii="微软雅黑" w:cs="微软雅黑" w:eastAsia="微软雅黑" w:hAnsi="微软雅黑"/>
+          <w:sz w:val="22"/>
+          <w:szCs w:val="22"/>
+        </w:rPr>
+        <w:t xml:space="preserve">客户通过《ETF 厂商产品提报表》（随附 Excel）提报产品，按前锋 / 中场 / 后卫 / 门将分位置填写</w:t>
+      </w:r>
+    </w:p>
+    <w:p>
+      <w:pPr>
+        <w:pStyle w:val="ListParagraph"/>
+        <w:numPr>
+          <w:ilvl w:val="0"/>
+          <w:numId w:val="2"/>
+        </w:numPr>
+        <w:spacing w:after="80"/>
+      </w:pPr>
+      <w:r>
+        <w:rPr>
+          <w:rFonts w:ascii="微软雅黑" w:cs="微软雅黑" w:eastAsia="微软雅黑" w:hAnsi="微软雅黑"/>
+          <w:sz w:val="22"/>
+          <w:szCs w:val="22"/>
+        </w:rPr>
+        <w:t xml:space="preserve">运营同学按提报表，在后台 / 产品配置中手动更新当周的 ETF 名单</w:t>
+      </w:r>
+    </w:p>
+    <w:p>
+      <w:pPr>
+        <w:pStyle w:val="ListParagraph"/>
+        <w:numPr>
+          <w:ilvl w:val="0"/>
+          <w:numId w:val="2"/>
+        </w:numPr>
+        <w:spacing w:after="80"/>
+      </w:pPr>
+      <w:r>
+        <w:rPr>
+          <w:rFonts w:ascii="微软雅黑" w:cs="微软雅黑" w:eastAsia="微软雅黑" w:hAnsi="微软雅黑"/>
+          <w:sz w:val="22"/>
+          <w:szCs w:val="22"/>
+        </w:rPr>
+        <w:t xml:space="preserve">当前 H5 产品数据以配置文件形式维护（src/data/etfs.js），已预留接口位，后续接 GET /api/etf-campaign/products 后改为后台可视化配置</w:t>
+      </w:r>
+    </w:p>
+    <w:p>
+      <w:pPr>
+        <w:pStyle w:val="Heading3"/>
+        <w:spacing w:after="120" w:before="220"/>
+      </w:pPr>
+      <w:r>
+        <w:rPr>
+          <w:rFonts w:ascii="微软雅黑" w:cs="微软雅黑" w:eastAsia="微软雅黑" w:hAnsi="微软雅黑"/>
+          <w:b/>
+          <w:bCs/>
+          <w:color w:val="2A85E0"/>
+          <w:sz w:val="22"/>
+          <w:szCs w:val="22"/>
+        </w:rPr>
+        <w:t xml:space="preserve">提报表字段</w:t>
+      </w:r>
+    </w:p>
+    <w:p>
+      <w:pPr>
+        <w:pStyle w:val="ListParagraph"/>
+        <w:numPr>
+          <w:ilvl w:val="0"/>
+          <w:numId w:val="2"/>
+        </w:numPr>
+        <w:spacing w:after="80"/>
+      </w:pPr>
+      <w:r>
+        <w:rPr>
+          <w:rFonts w:ascii="微软雅黑" w:cs="微软雅黑" w:eastAsia="微软雅黑" w:hAnsi="微软雅黑"/>
+          <w:sz w:val="22"/>
+          <w:szCs w:val="22"/>
+        </w:rPr>
+        <w:t xml:space="preserve">位置、ETF 简称、ETF 代码、基金公司、产品一句话简介、风险等级、建议球员技能名</w:t>
+      </w:r>
+    </w:p>
+    <w:p>
+      <w:pPr>
+        <w:pStyle w:val="ListParagraph"/>
+        <w:numPr>
+          <w:ilvl w:val="0"/>
+          <w:numId w:val="2"/>
+        </w:numPr>
+        <w:spacing w:after="80"/>
+      </w:pPr>
+      <w:r>
+        <w:rPr>
+          <w:rFonts w:ascii="微软雅黑" w:cs="微软雅黑" w:eastAsia="微软雅黑" w:hAnsi="微软雅黑"/>
+          <w:sz w:val="22"/>
+          <w:szCs w:val="22"/>
+        </w:rPr>
+        <w:t xml:space="preserve">五维评分由雪球运营统一设定，近一周涨跌幅由系统接行情接口，厂商均无需填写</w:t>
       </w:r>
     </w:p>
     <w:p>

</xml_diff>

<commit_message>
Weekly-only rewards + mandatory watchlist gate + per-position progress
1. Rewards → pure weekly: 周榜 TOP1=白酒一瓶, TOP2-5=棒球帽.
   Removed daily prize + quota rules section entirely.
2. 一键发布 now gates poster generation on 加自选 success.
   Only PAID sponsor products (华夏/易方达/富国 mock list) are force-added,
   not all 11. Reserved getPaidProductCodes() + endpoint for real list.
3. Result page buttons → 3: 一键发布(加自选+生成海报) / 分享朋友圈(gated until generated) / 重新组队.
   Removed 保存海报参加活动 + 重新生成.
4. Select page bottom: per-position progress detail (前锋已选X还需Y...).
5. Synced Home teaser, PosterCanvas prize strip, sponsorship doc.
</commit_message>
<xml_diff>
--- a/ETF球队老板H5招商说明书.docx
+++ b/ETF球队老板H5招商说明书.docx
@@ -1474,25 +1474,25 @@
           <w:sz w:val="26"/>
           <w:szCs w:val="26"/>
         </w:rPr>
-        <w:t xml:space="preserve">步骤 5：发布到雪球活动主贴</w:t>
-      </w:r>
-    </w:p>
-    <w:p>
-      <w:pPr>
-        <w:pStyle w:val="ListParagraph"/>
-        <w:numPr>
-          <w:ilvl w:val="0"/>
-          <w:numId w:val="2"/>
-        </w:numPr>
-        <w:spacing w:after="80"/>
-      </w:pPr>
-      <w:r>
-        <w:rPr>
-          <w:rFonts w:ascii="微软雅黑" w:cs="微软雅黑" w:eastAsia="微软雅黑" w:hAnsi="微软雅黑"/>
-          <w:sz w:val="22"/>
-          <w:szCs w:val="22"/>
-        </w:rPr>
-        <w:t xml:space="preserve">海报生成后给用户 3 个操作按钮（详见下方"互动机制"章节）：</w:t>
+        <w:t xml:space="preserve">步骤 5：一键发布</w:t>
+      </w:r>
+    </w:p>
+    <w:p>
+      <w:pPr>
+        <w:pStyle w:val="ListParagraph"/>
+        <w:numPr>
+          <w:ilvl w:val="0"/>
+          <w:numId w:val="2"/>
+        </w:numPr>
+        <w:spacing w:after="80"/>
+      </w:pPr>
+      <w:r>
+        <w:rPr>
+          <w:rFonts w:ascii="微软雅黑" w:cs="微软雅黑" w:eastAsia="微软雅黑" w:hAnsi="微软雅黑"/>
+          <w:sz w:val="22"/>
+          <w:szCs w:val="22"/>
+        </w:rPr>
+        <w:t xml:space="preserve">阵容评分页提供 3 个操作按钮（详见下方"互动机制"章节）：</w:t>
       </w:r>
     </w:p>
     <w:p>
@@ -1510,7 +1510,7 @@
           <w:sz w:val="22"/>
           <w:szCs w:val="22"/>
         </w:rPr>
-        <w:t xml:space="preserve">一键发布：保存海报到相册 + 一键加 11 只 ETF 到雪球自选 + 分享到朋友圈</w:t>
+        <w:t xml:space="preserve">一键发布：加自选（付费招商客户的产品）→ 生成海报 → 自动保存到相册</w:t>
       </w:r>
     </w:p>
     <w:p>
@@ -1528,7 +1528,7 @@
           <w:sz w:val="22"/>
           <w:szCs w:val="22"/>
         </w:rPr>
-        <w:t xml:space="preserve">保存海报参加活动：保存图片，引导用户跟帖到雪球活动主贴</w:t>
+        <w:t xml:space="preserve">分享朋友圈：将海报分享到微信朋友圈（生成海报后可用）</w:t>
       </w:r>
     </w:p>
     <w:p>
@@ -1546,7 +1546,25 @@
           <w:sz w:val="22"/>
           <w:szCs w:val="22"/>
         </w:rPr>
-        <w:t xml:space="preserve">重新生成：返回修改阵容</w:t>
+        <w:t xml:space="preserve">重新组队：返回重新挑选阵容</w:t>
+      </w:r>
+    </w:p>
+    <w:p>
+      <w:pPr>
+        <w:pStyle w:val="ListParagraph"/>
+        <w:numPr>
+          <w:ilvl w:val="1"/>
+          <w:numId w:val="2"/>
+        </w:numPr>
+        <w:spacing w:after="80"/>
+      </w:pPr>
+      <w:r>
+        <w:rPr>
+          <w:rFonts w:ascii="微软雅黑" w:cs="微软雅黑" w:eastAsia="微软雅黑" w:hAnsi="微软雅黑"/>
+          <w:sz w:val="22"/>
+          <w:szCs w:val="22"/>
+        </w:rPr>
+        <w:t xml:space="preserve">用户保存海报后，前往雪球活动主贴评论区跟帖发布，邀请球友点赞冲榜</w:t>
       </w:r>
     </w:p>
     <w:p>
@@ -1619,79 +1637,79 @@
           <w:sz w:val="26"/>
           <w:szCs w:val="26"/>
         </w:rPr>
-        <w:t xml:space="preserve">3.1 每日榜 TOP 5</w:t>
-      </w:r>
-    </w:p>
-    <w:p>
-      <w:pPr>
-        <w:pStyle w:val="ListParagraph"/>
-        <w:numPr>
-          <w:ilvl w:val="0"/>
-          <w:numId w:val="2"/>
-        </w:numPr>
-        <w:spacing w:after="80"/>
-      </w:pPr>
-      <w:r>
-        <w:rPr>
-          <w:rFonts w:ascii="微软雅黑" w:cs="微软雅黑" w:eastAsia="微软雅黑" w:hAnsi="微软雅黑"/>
-          <w:sz w:val="22"/>
-          <w:szCs w:val="22"/>
-        </w:rPr>
-        <w:t xml:space="preserve">结算节点：每日 24:00</w:t>
-      </w:r>
-    </w:p>
-    <w:p>
-      <w:pPr>
-        <w:pStyle w:val="ListParagraph"/>
-        <w:numPr>
-          <w:ilvl w:val="0"/>
-          <w:numId w:val="2"/>
-        </w:numPr>
-        <w:spacing w:after="80"/>
-      </w:pPr>
-      <w:r>
-        <w:rPr>
-          <w:rFonts w:ascii="微软雅黑" w:cs="微软雅黑" w:eastAsia="微软雅黑" w:hAnsi="微软雅黑"/>
-          <w:sz w:val="22"/>
-          <w:szCs w:val="22"/>
-        </w:rPr>
-        <w:t xml:space="preserve">计票口径：当日在雪球活动主贴下用户海报跟帖的点赞数</w:t>
-      </w:r>
-    </w:p>
-    <w:p>
-      <w:pPr>
-        <w:pStyle w:val="ListParagraph"/>
-        <w:numPr>
-          <w:ilvl w:val="0"/>
-          <w:numId w:val="2"/>
-        </w:numPr>
-        <w:spacing w:after="80"/>
-      </w:pPr>
-      <w:r>
-        <w:rPr>
-          <w:rFonts w:ascii="微软雅黑" w:cs="微软雅黑" w:eastAsia="微软雅黑" w:hAnsi="微软雅黑"/>
-          <w:sz w:val="22"/>
-          <w:szCs w:val="22"/>
-        </w:rPr>
-        <w:t xml:space="preserve">奖品：雪球品牌棒球帽 × 1 顶</w:t>
-      </w:r>
-    </w:p>
-    <w:p>
-      <w:pPr>
-        <w:pStyle w:val="ListParagraph"/>
-        <w:numPr>
-          <w:ilvl w:val="0"/>
-          <w:numId w:val="2"/>
-        </w:numPr>
-        <w:spacing w:after="80"/>
-      </w:pPr>
-      <w:r>
-        <w:rPr>
-          <w:rFonts w:ascii="微软雅黑" w:cs="微软雅黑" w:eastAsia="微软雅黑" w:hAnsi="微软雅黑"/>
-          <w:sz w:val="22"/>
-          <w:szCs w:val="22"/>
-        </w:rPr>
-        <w:t xml:space="preserve">每日 5 名得主</w:t>
+        <w:t xml:space="preserve">3.1 评奖机制（按周评奖）</w:t>
+      </w:r>
+    </w:p>
+    <w:p>
+      <w:pPr>
+        <w:pStyle w:val="ListParagraph"/>
+        <w:numPr>
+          <w:ilvl w:val="0"/>
+          <w:numId w:val="2"/>
+        </w:numPr>
+        <w:spacing w:after="80"/>
+      </w:pPr>
+      <w:r>
+        <w:rPr>
+          <w:rFonts w:ascii="微软雅黑" w:cs="微软雅黑" w:eastAsia="微软雅黑" w:hAnsi="微软雅黑"/>
+          <w:sz w:val="22"/>
+          <w:szCs w:val="22"/>
+        </w:rPr>
+        <w:t xml:space="preserve">结算节点：每周日 24:00 结算本周点赞数</w:t>
+      </w:r>
+    </w:p>
+    <w:p>
+      <w:pPr>
+        <w:pStyle w:val="ListParagraph"/>
+        <w:numPr>
+          <w:ilvl w:val="0"/>
+          <w:numId w:val="2"/>
+        </w:numPr>
+        <w:spacing w:after="80"/>
+      </w:pPr>
+      <w:r>
+        <w:rPr>
+          <w:rFonts w:ascii="微软雅黑" w:cs="微软雅黑" w:eastAsia="微软雅黑" w:hAnsi="微软雅黑"/>
+          <w:sz w:val="22"/>
+          <w:szCs w:val="22"/>
+        </w:rPr>
+        <w:t xml:space="preserve">计票口径：本周在雪球活动主贴下用户海报跟帖的点赞数</w:t>
+      </w:r>
+    </w:p>
+    <w:p>
+      <w:pPr>
+        <w:pStyle w:val="ListParagraph"/>
+        <w:numPr>
+          <w:ilvl w:val="0"/>
+          <w:numId w:val="2"/>
+        </w:numPr>
+        <w:spacing w:after="80"/>
+      </w:pPr>
+      <w:r>
+        <w:rPr>
+          <w:rFonts w:ascii="微软雅黑" w:cs="微软雅黑" w:eastAsia="微软雅黑" w:hAnsi="微软雅黑"/>
+          <w:sz w:val="22"/>
+          <w:szCs w:val="22"/>
+        </w:rPr>
+        <w:t xml:space="preserve">周榜第 1 名：雪球品牌白酒 × 1 瓶</w:t>
+      </w:r>
+    </w:p>
+    <w:p>
+      <w:pPr>
+        <w:pStyle w:val="ListParagraph"/>
+        <w:numPr>
+          <w:ilvl w:val="0"/>
+          <w:numId w:val="2"/>
+        </w:numPr>
+        <w:spacing w:after="80"/>
+      </w:pPr>
+      <w:r>
+        <w:rPr>
+          <w:rFonts w:ascii="微软雅黑" w:cs="微软雅黑" w:eastAsia="微软雅黑" w:hAnsi="微软雅黑"/>
+          <w:sz w:val="22"/>
+          <w:szCs w:val="22"/>
+        </w:rPr>
+        <w:t xml:space="preserve">周榜第 2 / 3 / 4 / 5 名：雪球品牌棒球帽 × 1 顶</w:t>
       </w:r>
     </w:p>
     <w:p>
@@ -1708,79 +1726,61 @@
           <w:sz w:val="26"/>
           <w:szCs w:val="26"/>
         </w:rPr>
-        <w:t xml:space="preserve">3.2 每周榜 TOP 1</w:t>
-      </w:r>
-    </w:p>
-    <w:p>
-      <w:pPr>
-        <w:pStyle w:val="ListParagraph"/>
-        <w:numPr>
-          <w:ilvl w:val="0"/>
-          <w:numId w:val="2"/>
-        </w:numPr>
-        <w:spacing w:after="80"/>
-      </w:pPr>
-      <w:r>
-        <w:rPr>
-          <w:rFonts w:ascii="微软雅黑" w:cs="微软雅黑" w:eastAsia="微软雅黑" w:hAnsi="微软雅黑"/>
-          <w:sz w:val="22"/>
-          <w:szCs w:val="22"/>
-        </w:rPr>
-        <w:t xml:space="preserve">结算节点：每周日 24:00</w:t>
-      </w:r>
-    </w:p>
-    <w:p>
-      <w:pPr>
-        <w:pStyle w:val="ListParagraph"/>
-        <w:numPr>
-          <w:ilvl w:val="0"/>
-          <w:numId w:val="2"/>
-        </w:numPr>
-        <w:spacing w:after="80"/>
-      </w:pPr>
-      <w:r>
-        <w:rPr>
-          <w:rFonts w:ascii="微软雅黑" w:cs="微软雅黑" w:eastAsia="微软雅黑" w:hAnsi="微软雅黑"/>
-          <w:sz w:val="22"/>
-          <w:szCs w:val="22"/>
-        </w:rPr>
-        <w:t xml:space="preserve">计票口径：本周累计点赞数</w:t>
-      </w:r>
-    </w:p>
-    <w:p>
-      <w:pPr>
-        <w:pStyle w:val="ListParagraph"/>
-        <w:numPr>
-          <w:ilvl w:val="0"/>
-          <w:numId w:val="2"/>
-        </w:numPr>
-        <w:spacing w:after="80"/>
-      </w:pPr>
-      <w:r>
-        <w:rPr>
-          <w:rFonts w:ascii="微软雅黑" w:cs="微软雅黑" w:eastAsia="微软雅黑" w:hAnsi="微软雅黑"/>
-          <w:sz w:val="22"/>
-          <w:szCs w:val="22"/>
-        </w:rPr>
-        <w:t xml:space="preserve">奖品：雪球品牌白酒 × 1 瓶</w:t>
-      </w:r>
-    </w:p>
-    <w:p>
-      <w:pPr>
-        <w:pStyle w:val="ListParagraph"/>
-        <w:numPr>
-          <w:ilvl w:val="0"/>
-          <w:numId w:val="2"/>
-        </w:numPr>
-        <w:spacing w:after="80"/>
-      </w:pPr>
-      <w:r>
-        <w:rPr>
-          <w:rFonts w:ascii="微软雅黑" w:cs="微软雅黑" w:eastAsia="微软雅黑" w:hAnsi="微软雅黑"/>
-          <w:sz w:val="22"/>
-          <w:szCs w:val="22"/>
-        </w:rPr>
-        <w:t xml:space="preserve">每周开奖 1 名，与每日奖可叠加</w:t>
+        <w:t xml:space="preserve">3.2 点赞规则</w:t>
+      </w:r>
+    </w:p>
+    <w:p>
+      <w:pPr>
+        <w:pStyle w:val="ListParagraph"/>
+        <w:numPr>
+          <w:ilvl w:val="0"/>
+          <w:numId w:val="2"/>
+        </w:numPr>
+        <w:spacing w:after="80"/>
+      </w:pPr>
+      <w:r>
+        <w:rPr>
+          <w:rFonts w:ascii="微软雅黑" w:cs="微软雅黑" w:eastAsia="微软雅黑" w:hAnsi="微软雅黑"/>
+          <w:sz w:val="22"/>
+          <w:szCs w:val="22"/>
+        </w:rPr>
+        <w:t xml:space="preserve">所有点赞均发生在雪球活动主贴评论区，认用户海报跟帖的点赞数</w:t>
+      </w:r>
+    </w:p>
+    <w:p>
+      <w:pPr>
+        <w:pStyle w:val="ListParagraph"/>
+        <w:numPr>
+          <w:ilvl w:val="0"/>
+          <w:numId w:val="2"/>
+        </w:numPr>
+        <w:spacing w:after="80"/>
+      </w:pPr>
+      <w:r>
+        <w:rPr>
+          <w:rFonts w:ascii="微软雅黑" w:cs="微软雅黑" w:eastAsia="微软雅黑" w:hAnsi="微软雅黑"/>
+          <w:sz w:val="22"/>
+          <w:szCs w:val="22"/>
+        </w:rPr>
+        <w:t xml:space="preserve">每个用户每天最多为同一条海报点赞 1 次</w:t>
+      </w:r>
+    </w:p>
+    <w:p>
+      <w:pPr>
+        <w:pStyle w:val="ListParagraph"/>
+        <w:numPr>
+          <w:ilvl w:val="0"/>
+          <w:numId w:val="2"/>
+        </w:numPr>
+        <w:spacing w:after="80"/>
+      </w:pPr>
+      <w:r>
+        <w:rPr>
+          <w:rFonts w:ascii="微软雅黑" w:cs="微软雅黑" w:eastAsia="微软雅黑" w:hAnsi="微软雅黑"/>
+          <w:sz w:val="22"/>
+          <w:szCs w:val="22"/>
+        </w:rPr>
+        <w:t xml:space="preserve">检测到刷赞 / 小号互赞将取消评奖资格</w:t>
       </w:r>
     </w:p>
     <w:p>
@@ -1797,167 +1797,25 @@
           <w:sz w:val="26"/>
           <w:szCs w:val="26"/>
         </w:rPr>
-        <w:t xml:space="preserve">3.3 获奖名额规则</w:t>
-      </w:r>
-    </w:p>
-    <w:p>
-      <w:pPr>
-        <w:pStyle w:val="ListParagraph"/>
-        <w:numPr>
-          <w:ilvl w:val="0"/>
-          <w:numId w:val="2"/>
-        </w:numPr>
-        <w:spacing w:after="80"/>
-      </w:pPr>
-      <w:r>
-        <w:rPr>
-          <w:rFonts w:ascii="微软雅黑" w:cs="微软雅黑" w:eastAsia="微软雅黑" w:hAnsi="微软雅黑"/>
-          <w:sz w:val="22"/>
-          <w:szCs w:val="22"/>
-        </w:rPr>
-        <w:t xml:space="preserve">日度奖：同一用户每周最多获得 1 次。一周内多次进入日榜 TOP 5，从第 2 次起名额顺延给下一名；下一周重新计算，可再获 1 次</w:t>
-      </w:r>
-    </w:p>
-    <w:p>
-      <w:pPr>
-        <w:pStyle w:val="ListParagraph"/>
-        <w:numPr>
-          <w:ilvl w:val="0"/>
-          <w:numId w:val="2"/>
-        </w:numPr>
-        <w:spacing w:after="80"/>
-      </w:pPr>
-      <w:r>
-        <w:rPr>
-          <w:rFonts w:ascii="微软雅黑" w:cs="微软雅黑" w:eastAsia="微软雅黑" w:hAnsi="微软雅黑"/>
-          <w:sz w:val="22"/>
-          <w:szCs w:val="22"/>
-        </w:rPr>
-        <w:t xml:space="preserve">周度奖：同一用户在整个活动期内最多获得 1 次。若再次成为周榜第一，奖品顺延给第二名</w:t>
-      </w:r>
-    </w:p>
-    <w:p>
-      <w:pPr>
-        <w:pStyle w:val="ListParagraph"/>
-        <w:numPr>
-          <w:ilvl w:val="0"/>
-          <w:numId w:val="2"/>
-        </w:numPr>
-        <w:spacing w:after="80"/>
-      </w:pPr>
-      <w:r>
-        <w:rPr>
-          <w:rFonts w:ascii="微软雅黑" w:cs="微软雅黑" w:eastAsia="微软雅黑" w:hAnsi="微软雅黑"/>
-          <w:sz w:val="22"/>
-          <w:szCs w:val="22"/>
-        </w:rPr>
-        <w:t xml:space="preserve">日度奖与周度奖互不影响，可同时获得</w:t>
-      </w:r>
-    </w:p>
-    <w:p>
-      <w:pPr>
-        <w:pStyle w:val="Heading2"/>
-        <w:spacing w:after="160" w:before="280"/>
-      </w:pPr>
-      <w:r>
-        <w:rPr>
-          <w:rFonts w:ascii="微软雅黑" w:cs="微软雅黑" w:eastAsia="微软雅黑" w:hAnsi="微软雅黑"/>
-          <w:b/>
-          <w:bCs/>
-          <w:color w:val="0A0A0A"/>
-          <w:sz w:val="26"/>
-          <w:szCs w:val="26"/>
-        </w:rPr>
-        <w:t xml:space="preserve">3.4 点赞规则</w:t>
-      </w:r>
-    </w:p>
-    <w:p>
-      <w:pPr>
-        <w:pStyle w:val="ListParagraph"/>
-        <w:numPr>
-          <w:ilvl w:val="0"/>
-          <w:numId w:val="2"/>
-        </w:numPr>
-        <w:spacing w:after="80"/>
-      </w:pPr>
-      <w:r>
-        <w:rPr>
-          <w:rFonts w:ascii="微软雅黑" w:cs="微软雅黑" w:eastAsia="微软雅黑" w:hAnsi="微软雅黑"/>
-          <w:sz w:val="22"/>
-          <w:szCs w:val="22"/>
-        </w:rPr>
-        <w:t xml:space="preserve">所有点赞均发生在雪球活动主贴评论区，认用户海报跟帖的点赞数</w:t>
-      </w:r>
-    </w:p>
-    <w:p>
-      <w:pPr>
-        <w:pStyle w:val="ListParagraph"/>
-        <w:numPr>
-          <w:ilvl w:val="0"/>
-          <w:numId w:val="2"/>
-        </w:numPr>
-        <w:spacing w:after="80"/>
-      </w:pPr>
-      <w:r>
-        <w:rPr>
-          <w:rFonts w:ascii="微软雅黑" w:cs="微软雅黑" w:eastAsia="微软雅黑" w:hAnsi="微软雅黑"/>
-          <w:sz w:val="22"/>
-          <w:szCs w:val="22"/>
-        </w:rPr>
-        <w:t xml:space="preserve">每个用户每天最多为同一条海报点赞 1 次</w:t>
-      </w:r>
-    </w:p>
-    <w:p>
-      <w:pPr>
-        <w:pStyle w:val="ListParagraph"/>
-        <w:numPr>
-          <w:ilvl w:val="0"/>
-          <w:numId w:val="2"/>
-        </w:numPr>
-        <w:spacing w:after="80"/>
-      </w:pPr>
-      <w:r>
-        <w:rPr>
-          <w:rFonts w:ascii="微软雅黑" w:cs="微软雅黑" w:eastAsia="微软雅黑" w:hAnsi="微软雅黑"/>
-          <w:sz w:val="22"/>
-          <w:szCs w:val="22"/>
-        </w:rPr>
-        <w:t xml:space="preserve">检测到刷赞 / 小号互赞将取消评奖资格</w:t>
-      </w:r>
-    </w:p>
-    <w:p>
-      <w:pPr>
-        <w:pStyle w:val="Heading2"/>
-        <w:spacing w:after="160" w:before="280"/>
-      </w:pPr>
-      <w:r>
-        <w:rPr>
-          <w:rFonts w:ascii="微软雅黑" w:cs="微软雅黑" w:eastAsia="微软雅黑" w:hAnsi="微软雅黑"/>
-          <w:b/>
-          <w:bCs/>
-          <w:color w:val="0A0A0A"/>
-          <w:sz w:val="26"/>
-          <w:szCs w:val="26"/>
-        </w:rPr>
-        <w:t xml:space="preserve">3.5 开奖与发奖通知</w:t>
-      </w:r>
-    </w:p>
-    <w:p>
-      <w:pPr>
-        <w:pStyle w:val="ListParagraph"/>
-        <w:numPr>
-          <w:ilvl w:val="0"/>
-          <w:numId w:val="2"/>
-        </w:numPr>
-        <w:spacing w:after="80"/>
-      </w:pPr>
-      <w:r>
-        <w:rPr>
-          <w:rFonts w:ascii="微软雅黑" w:cs="微软雅黑" w:eastAsia="微软雅黑" w:hAnsi="微软雅黑"/>
-          <w:sz w:val="22"/>
-          <w:szCs w:val="22"/>
-        </w:rPr>
-        <w:t xml:space="preserve">开奖公示：每天发布一篇雪球帖子，公示当日 / 当周获奖人员名单</w:t>
+        <w:t xml:space="preserve">3.3 开奖与发奖通知</w:t>
+      </w:r>
+    </w:p>
+    <w:p>
+      <w:pPr>
+        <w:pStyle w:val="ListParagraph"/>
+        <w:numPr>
+          <w:ilvl w:val="0"/>
+          <w:numId w:val="2"/>
+        </w:numPr>
+        <w:spacing w:after="80"/>
+      </w:pPr>
+      <w:r>
+        <w:rPr>
+          <w:rFonts w:ascii="微软雅黑" w:cs="微软雅黑" w:eastAsia="微软雅黑" w:hAnsi="微软雅黑"/>
+          <w:sz w:val="22"/>
+          <w:szCs w:val="22"/>
+        </w:rPr>
+        <w:t xml:space="preserve">开奖公示：每周发布一篇雪球帖子，公示当周获奖人员名单</w:t>
       </w:r>
     </w:p>
     <w:p>
@@ -5196,7 +5054,7 @@
           <w:sz w:val="22"/>
           <w:szCs w:val="22"/>
         </w:rPr>
-        <w:t xml:space="preserve">用户生成海报后，会看到三个并列的操作按钮：</w:t>
+        <w:t xml:space="preserve">阵容评分页提供三个操作按钮：</w:t>
       </w:r>
     </w:p>
     <w:p>
@@ -5244,7 +5102,7 @@
           <w:sz w:val="22"/>
           <w:szCs w:val="22"/>
         </w:rPr>
-        <w:t xml:space="preserve">保存海报到相册</w:t>
+        <w:t xml:space="preserve">加自选：将阵容中「付费招商客户」的产品强制加入雪球自选列表</w:t>
       </w:r>
     </w:p>
     <w:p>
@@ -5262,7 +5120,7 @@
           <w:sz w:val="22"/>
           <w:szCs w:val="22"/>
         </w:rPr>
-        <w:t xml:space="preserve">一键将 11 只 ETF 加入雪球自选列表（接 JSBridge）</w:t>
+        <w:t xml:space="preserve">加自选成功后，才会生成海报（不加自选则无法生成）</w:t>
       </w:r>
     </w:p>
     <w:p>
@@ -5280,7 +5138,7 @@
           <w:sz w:val="22"/>
           <w:szCs w:val="22"/>
         </w:rPr>
-        <w:t xml:space="preserve">调起朋友圈分享面板（接 JSBridge）</w:t>
+        <w:t xml:space="preserve">海报生成后自动保存到相册</w:t>
       </w:r>
     </w:p>
     <w:p>
@@ -5301,7 +5159,78 @@
           <w:sz w:val="22"/>
           <w:szCs w:val="22"/>
         </w:rPr>
-        <w:t xml:space="preserve">💡 这个按钮是招商客户最看重的环节 —— 用户一键完成"保存→加自选→朋友圈"三个动作，11 只 ETF（含招商方产品）一次性进入用户的自选股长期触达通道。</w:t>
+        <w:t xml:space="preserve">💡 这是招商客户最核心的商业价值点 —— 用户每次发布海报，付费客户的 ETF 都会被强制加入其雪球自选列表，进入长期触达通道。</w:t>
+      </w:r>
+    </w:p>
+    <w:p>
+      <w:pPr>
+        <w:pStyle w:val="Heading3"/>
+        <w:spacing w:after="120" w:before="220"/>
+      </w:pPr>
+      <w:r>
+        <w:rPr>
+          <w:rFonts w:ascii="微软雅黑" w:cs="微软雅黑" w:eastAsia="微软雅黑" w:hAnsi="微软雅黑"/>
+          <w:b/>
+          <w:bCs/>
+          <w:color w:val="2A85E0"/>
+          <w:sz w:val="22"/>
+          <w:szCs w:val="22"/>
+        </w:rPr>
+        <w:t xml:space="preserve">加自选范围</w:t>
+      </w:r>
+    </w:p>
+    <w:p>
+      <w:pPr>
+        <w:pStyle w:val="ListParagraph"/>
+        <w:numPr>
+          <w:ilvl w:val="0"/>
+          <w:numId w:val="2"/>
+        </w:numPr>
+        <w:spacing w:after="80"/>
+      </w:pPr>
+      <w:r>
+        <w:rPr>
+          <w:rFonts w:ascii="微软雅黑" w:cs="微软雅黑" w:eastAsia="微软雅黑" w:hAnsi="微软雅黑"/>
+          <w:sz w:val="22"/>
+          <w:szCs w:val="22"/>
+        </w:rPr>
+        <w:t xml:space="preserve">只强制加入「付费招商客户」的产品，不是阵容里全部 11 只</w:t>
+      </w:r>
+    </w:p>
+    <w:p>
+      <w:pPr>
+        <w:pStyle w:val="ListParagraph"/>
+        <w:numPr>
+          <w:ilvl w:val="0"/>
+          <w:numId w:val="2"/>
+        </w:numPr>
+        <w:spacing w:after="80"/>
+      </w:pPr>
+      <w:r>
+        <w:rPr>
+          <w:rFonts w:ascii="微软雅黑" w:cs="微软雅黑" w:eastAsia="微软雅黑" w:hAnsi="微软雅黑"/>
+          <w:sz w:val="22"/>
+          <w:szCs w:val="22"/>
+        </w:rPr>
+        <w:t xml:space="preserve">哪些客户为付费客户由后台名单决定 —— 预留接口 GET /api/etf-campaign/sponsors，运营可配置</w:t>
+      </w:r>
+    </w:p>
+    <w:p>
+      <w:pPr>
+        <w:pStyle w:val="ListParagraph"/>
+        <w:numPr>
+          <w:ilvl w:val="0"/>
+          <w:numId w:val="2"/>
+        </w:numPr>
+        <w:spacing w:after="80"/>
+      </w:pPr>
+      <w:r>
+        <w:rPr>
+          <w:rFonts w:ascii="微软雅黑" w:cs="微软雅黑" w:eastAsia="微软雅黑" w:hAnsi="微软雅黑"/>
+          <w:sz w:val="22"/>
+          <w:szCs w:val="22"/>
+        </w:rPr>
+        <w:t xml:space="preserve">当前 H5 演示用代码内置名单（华夏 / 易方达 / 富国）模拟付费客户</w:t>
       </w:r>
     </w:p>
     <w:p>
@@ -5318,7 +5247,7 @@
           <w:sz w:val="26"/>
           <w:szCs w:val="26"/>
         </w:rPr>
-        <w:t xml:space="preserve">6.2 次级：💾 保存海报参加活动</w:t>
+        <w:t xml:space="preserve">6.2 分享朋友圈</w:t>
       </w:r>
     </w:p>
     <w:p>
@@ -5331,7 +5260,7 @@
           <w:sz w:val="22"/>
           <w:szCs w:val="22"/>
         </w:rPr>
-        <w:t xml:space="preserve">为不想加自选/分享朋友圈的用户提供单独通道：只保存图片，引导用户跟帖到雪球活动主贴评论区集赞冲奖。</w:t>
+        <w:t xml:space="preserve">生成海报后可用，将海报分享到微信朋友圈，扩大传播。</w:t>
       </w:r>
     </w:p>
     <w:p>
@@ -5348,7 +5277,7 @@
           <w:sz w:val="26"/>
           <w:szCs w:val="26"/>
         </w:rPr>
-        <w:t xml:space="preserve">6.3 兜底：🔄 重新生成</w:t>
+        <w:t xml:space="preserve">6.3 重新组队</w:t>
       </w:r>
     </w:p>
     <w:p>
@@ -5361,7 +5290,45 @@
           <w:sz w:val="22"/>
           <w:szCs w:val="22"/>
         </w:rPr>
-        <w:t xml:space="preserve">若用户不满意当前阵容，可返回继续修改。</w:t>
+        <w:t xml:space="preserve">返回首页重新挑选阵容。</w:t>
+      </w:r>
+    </w:p>
+    <w:p>
+      <w:pPr>
+        <w:pStyle w:val="Heading3"/>
+        <w:spacing w:after="120" w:before="220"/>
+      </w:pPr>
+      <w:r>
+        <w:rPr>
+          <w:rFonts w:ascii="微软雅黑" w:cs="微软雅黑" w:eastAsia="微软雅黑" w:hAnsi="微软雅黑"/>
+          <w:b/>
+          <w:bCs/>
+          <w:color w:val="2A85E0"/>
+          <w:sz w:val="22"/>
+          <w:szCs w:val="22"/>
+        </w:rPr>
+        <w:t xml:space="preserve">集赞与活动参与</w:t>
+      </w:r>
+    </w:p>
+    <w:p>
+      <w:pPr>
+        <w:spacing w:after="100"/>
+        <w:rPr>
+          <w:i/>
+          <w:iCs/>
+          <w:color w:val="666666"/>
+        </w:rPr>
+      </w:pPr>
+      <w:r>
+        <w:rPr>
+          <w:rFonts w:ascii="微软雅黑" w:cs="微软雅黑" w:eastAsia="微软雅黑" w:hAnsi="微软雅黑"/>
+          <w:i/>
+          <w:iCs/>
+          <w:color w:val="666666"/>
+          <w:sz w:val="22"/>
+          <w:szCs w:val="22"/>
+        </w:rPr>
+        <w:t xml:space="preserve">海报通过「一键发布」自动保存到相册后，用户前往雪球活动主贴评论区跟帖发布海报，球友在主贴下点赞，即参与每周评奖。</w:t>
       </w:r>
     </w:p>
     <w:p>

</xml_diff>